<commit_message>
Ultima revision de documentos
</commit_message>
<xml_diff>
--- a/Fase 2/Evidencias Proyecto/Evidencias de documentacion/DAS-Documento Arquitectura Sistema.docx
+++ b/Fase 2/Evidencias Proyecto/Evidencias de documentacion/DAS-Documento Arquitectura Sistema.docx
@@ -137,7 +137,27 @@
           <w:szCs w:val="44"/>
           <w:lang w:val="en-US"/>
         </w:rPr>
-        <w:t>Sitio web MiPC Ideal</w:t>
+        <w:t xml:space="preserve">Sitio web </w:t>
+      </w:r>
+      <w:proofErr w:type="spellStart"/>
+      <w:r>
+        <w:rPr>
+          <w:rFonts w:ascii="Arial" w:hAnsi="Arial" w:cs="Arial"/>
+          <w:sz w:val="44"/>
+          <w:szCs w:val="44"/>
+          <w:lang w:val="en-US"/>
+        </w:rPr>
+        <w:t>MiPC</w:t>
+      </w:r>
+      <w:proofErr w:type="spellEnd"/>
+      <w:r>
+        <w:rPr>
+          <w:rFonts w:ascii="Arial" w:hAnsi="Arial" w:cs="Arial"/>
+          <w:sz w:val="44"/>
+          <w:szCs w:val="44"/>
+          <w:lang w:val="en-US"/>
+        </w:rPr>
+        <w:t xml:space="preserve"> Ideal</w:t>
       </w:r>
     </w:p>
     <w:p>
@@ -222,13 +242,23 @@
           <w:lang w:val="en-US"/>
         </w:rPr>
       </w:pPr>
+      <w:proofErr w:type="spellStart"/>
       <w:r>
         <w:rPr>
           <w:rFonts w:ascii="Arial" w:hAnsi="Arial" w:cs="Arial"/>
           <w:sz w:val="36"/>
           <w:lang w:val="en-US"/>
         </w:rPr>
-        <w:t xml:space="preserve">Versión </w:t>
+        <w:t>Versión</w:t>
+      </w:r>
+      <w:proofErr w:type="spellEnd"/>
+      <w:r>
+        <w:rPr>
+          <w:rFonts w:ascii="Arial" w:hAnsi="Arial" w:cs="Arial"/>
+          <w:sz w:val="36"/>
+          <w:lang w:val="en-US"/>
+        </w:rPr>
+        <w:t xml:space="preserve"> </w:t>
       </w:r>
       <w:r>
         <w:rPr>
@@ -477,13 +507,23 @@
                 <w:szCs w:val="20"/>
               </w:rPr>
             </w:pPr>
-            <w:r>
-              <w:rPr>
-                <w:rFonts w:ascii="Arial" w:hAnsi="Arial" w:cs="Arial"/>
-                <w:sz w:val="20"/>
-                <w:szCs w:val="20"/>
-              </w:rPr>
-              <w:t>MiPC Ideal</w:t>
+            <w:proofErr w:type="spellStart"/>
+            <w:r>
+              <w:rPr>
+                <w:rFonts w:ascii="Arial" w:hAnsi="Arial" w:cs="Arial"/>
+                <w:sz w:val="20"/>
+                <w:szCs w:val="20"/>
+              </w:rPr>
+              <w:t>MiPC</w:t>
+            </w:r>
+            <w:proofErr w:type="spellEnd"/>
+            <w:r>
+              <w:rPr>
+                <w:rFonts w:ascii="Arial" w:hAnsi="Arial" w:cs="Arial"/>
+                <w:sz w:val="20"/>
+                <w:szCs w:val="20"/>
+              </w:rPr>
+              <w:t xml:space="preserve"> Ideal</w:t>
             </w:r>
           </w:p>
         </w:tc>
@@ -992,6 +1032,9 @@
                 <w:szCs w:val="20"/>
               </w:rPr>
             </w:pPr>
+            <w:r>
+              <w:t>JORGE ALBERTO CASTRO SILVESTRE</w:t>
+            </w:r>
           </w:p>
         </w:tc>
       </w:tr>
@@ -1087,6 +1130,15 @@
                 <w:szCs w:val="20"/>
               </w:rPr>
             </w:pPr>
+            <w:r>
+              <w:rPr>
+                <w:rFonts w:ascii="Arial" w:hAnsi="Arial" w:cs="Arial"/>
+                <w:spacing w:val="-2"/>
+                <w:sz w:val="20"/>
+                <w:szCs w:val="20"/>
+              </w:rPr>
+              <w:t>14/10/2025</w:t>
+            </w:r>
           </w:p>
         </w:tc>
       </w:tr>
@@ -6068,7 +6120,25 @@
           <w:sz w:val="20"/>
           <w:szCs w:val="20"/>
         </w:rPr>
-        <w:t>Frente a esto, se propone MiPC Ideal: una web informativa y de recomendaciones que ayuda a personas con distintos niveles de conocimiento a elegir productos adecuados a su perfil y presupuesto.</w:t>
+        <w:t xml:space="preserve">Frente a esto, se propone </w:t>
+      </w:r>
+      <w:proofErr w:type="spellStart"/>
+      <w:r>
+        <w:rPr>
+          <w:rFonts w:ascii="Arial" w:hAnsi="Arial" w:cs="Arial"/>
+          <w:sz w:val="20"/>
+          <w:szCs w:val="20"/>
+        </w:rPr>
+        <w:t>MiPC</w:t>
+      </w:r>
+      <w:proofErr w:type="spellEnd"/>
+      <w:r>
+        <w:rPr>
+          <w:rFonts w:ascii="Arial" w:hAnsi="Arial" w:cs="Arial"/>
+          <w:sz w:val="20"/>
+          <w:szCs w:val="20"/>
+        </w:rPr>
+        <w:t xml:space="preserve"> Ideal: una web informativa y de recomendaciones que ayuda a personas con distintos niveles de conocimiento a elegir productos adecuados a su perfil y presupuesto.</w:t>
       </w:r>
     </w:p>
     <w:p>
@@ -6143,7 +6213,25 @@
           <w:sz w:val="20"/>
           <w:szCs w:val="20"/>
         </w:rPr>
-        <w:t>El propósito de MiPC Ideal es ayudar a las personas a elegir productos de computación con confianza, sin necesidad de ser expertas. La plataforma traduce especificaciones técnicas a usos reales (jugar, estudiar, trabajar/diseñar, uso del hogar), ofreciendo recomendaciones personalizadas, guías simples y comparativas útiles.</w:t>
+        <w:t xml:space="preserve">El propósito de </w:t>
+      </w:r>
+      <w:proofErr w:type="spellStart"/>
+      <w:r>
+        <w:rPr>
+          <w:rFonts w:ascii="Arial" w:hAnsi="Arial" w:cs="Arial"/>
+          <w:sz w:val="20"/>
+          <w:szCs w:val="20"/>
+        </w:rPr>
+        <w:t>MiPC</w:t>
+      </w:r>
+      <w:proofErr w:type="spellEnd"/>
+      <w:r>
+        <w:rPr>
+          <w:rFonts w:ascii="Arial" w:hAnsi="Arial" w:cs="Arial"/>
+          <w:sz w:val="20"/>
+          <w:szCs w:val="20"/>
+        </w:rPr>
+        <w:t xml:space="preserve"> Ideal es ayudar a las personas a elegir productos de computación con confianza, sin necesidad de ser expertas. La plataforma traduce especificaciones técnicas a usos reales (jugar, estudiar, trabajar/diseñar, uso del hogar), ofreciendo recomendaciones personalizadas, guías simples y comparativas útiles.</w:t>
       </w:r>
     </w:p>
     <w:p>
@@ -6235,7 +6323,25 @@
           <w:sz w:val="20"/>
           <w:szCs w:val="20"/>
         </w:rPr>
-        <w:t>Ajustar la recomendación al perfil y presupuesto del usuario (sin vender, sin checkout).</w:t>
+        <w:t xml:space="preserve">Ajustar la recomendación al perfil y presupuesto del usuario (sin vender, sin </w:t>
+      </w:r>
+      <w:proofErr w:type="spellStart"/>
+      <w:r>
+        <w:rPr>
+          <w:rFonts w:ascii="Arial" w:hAnsi="Arial" w:cs="Arial"/>
+          <w:sz w:val="20"/>
+          <w:szCs w:val="20"/>
+        </w:rPr>
+        <w:t>checkout</w:t>
+      </w:r>
+      <w:proofErr w:type="spellEnd"/>
+      <w:r>
+        <w:rPr>
+          <w:rFonts w:ascii="Arial" w:hAnsi="Arial" w:cs="Arial"/>
+          <w:sz w:val="20"/>
+          <w:szCs w:val="20"/>
+        </w:rPr>
+        <w:t>).</w:t>
       </w:r>
     </w:p>
     <w:p>
@@ -6339,7 +6445,43 @@
           <w:sz w:val="20"/>
           <w:szCs w:val="20"/>
         </w:rPr>
-        <w:t>En síntesis, MiPC Ideal no es un e-commerce: es un asistente imparcial que orienta a cada persona hacia el equipo que realmente necesita, de forma simple, confiable y práctica.</w:t>
+        <w:t xml:space="preserve">En síntesis, </w:t>
+      </w:r>
+      <w:proofErr w:type="spellStart"/>
+      <w:r>
+        <w:rPr>
+          <w:rFonts w:ascii="Arial" w:hAnsi="Arial" w:cs="Arial"/>
+          <w:sz w:val="20"/>
+          <w:szCs w:val="20"/>
+        </w:rPr>
+        <w:t>MiPC</w:t>
+      </w:r>
+      <w:proofErr w:type="spellEnd"/>
+      <w:r>
+        <w:rPr>
+          <w:rFonts w:ascii="Arial" w:hAnsi="Arial" w:cs="Arial"/>
+          <w:sz w:val="20"/>
+          <w:szCs w:val="20"/>
+        </w:rPr>
+        <w:t xml:space="preserve"> Ideal no es un e-</w:t>
+      </w:r>
+      <w:proofErr w:type="spellStart"/>
+      <w:r>
+        <w:rPr>
+          <w:rFonts w:ascii="Arial" w:hAnsi="Arial" w:cs="Arial"/>
+          <w:sz w:val="20"/>
+          <w:szCs w:val="20"/>
+        </w:rPr>
+        <w:t>commerce</w:t>
+      </w:r>
+      <w:proofErr w:type="spellEnd"/>
+      <w:r>
+        <w:rPr>
+          <w:rFonts w:ascii="Arial" w:hAnsi="Arial" w:cs="Arial"/>
+          <w:sz w:val="20"/>
+          <w:szCs w:val="20"/>
+        </w:rPr>
+        <w:t>: es un asistente imparcial que orienta a cada persona hacia el equipo que realmente necesita, de forma simple, confiable y práctica.</w:t>
       </w:r>
     </w:p>
     <w:p>
@@ -6503,7 +6645,27 @@
           <w:szCs w:val="20"/>
           <w:lang w:val="es-CL"/>
         </w:rPr>
-        <w:t>Perfiles de uso (gamer, hogar, estudio, trabajo/diseño) y criterios claros por categoría.</w:t>
+        <w:t>Perfiles de uso (</w:t>
+      </w:r>
+      <w:proofErr w:type="spellStart"/>
+      <w:r>
+        <w:rPr>
+          <w:rFonts w:ascii="Arial" w:hAnsi="Arial" w:cs="Arial"/>
+          <w:sz w:val="20"/>
+          <w:szCs w:val="20"/>
+          <w:lang w:val="es-CL"/>
+        </w:rPr>
+        <w:t>gamer</w:t>
+      </w:r>
+      <w:proofErr w:type="spellEnd"/>
+      <w:r>
+        <w:rPr>
+          <w:rFonts w:ascii="Arial" w:hAnsi="Arial" w:cs="Arial"/>
+          <w:sz w:val="20"/>
+          <w:szCs w:val="20"/>
+          <w:lang w:val="es-CL"/>
+        </w:rPr>
+        <w:t>, hogar, estudio, trabajo/diseño) y criterios claros por categoría.</w:t>
       </w:r>
     </w:p>
     <w:p>
@@ -6587,7 +6749,27 @@
           <w:szCs w:val="20"/>
           <w:lang w:val="es-CL"/>
         </w:rPr>
-        <w:t>Sistema de reportes (usuarios pueden señalar información incorrecta; el admin revisa y actúa).</w:t>
+        <w:t xml:space="preserve">Sistema de reportes (usuarios pueden señalar información incorrecta; el </w:t>
+      </w:r>
+      <w:proofErr w:type="spellStart"/>
+      <w:r>
+        <w:rPr>
+          <w:rFonts w:ascii="Arial" w:hAnsi="Arial" w:cs="Arial"/>
+          <w:sz w:val="20"/>
+          <w:szCs w:val="20"/>
+          <w:lang w:val="es-CL"/>
+        </w:rPr>
+        <w:t>admin</w:t>
+      </w:r>
+      <w:proofErr w:type="spellEnd"/>
+      <w:r>
+        <w:rPr>
+          <w:rFonts w:ascii="Arial" w:hAnsi="Arial" w:cs="Arial"/>
+          <w:sz w:val="20"/>
+          <w:szCs w:val="20"/>
+          <w:lang w:val="es-CL"/>
+        </w:rPr>
+        <w:t xml:space="preserve"> revisa y actúa).</w:t>
       </w:r>
     </w:p>
     <w:p>
@@ -6675,7 +6857,67 @@
           <w:szCs w:val="20"/>
           <w:lang w:val="es-CL"/>
         </w:rPr>
-        <w:t>Fuera de alcance (Out of scope) en esta versión:</w:t>
+        <w:t>Fuera de alcance (</w:t>
+      </w:r>
+      <w:proofErr w:type="spellStart"/>
+      <w:r>
+        <w:rPr>
+          <w:rFonts w:ascii="Arial" w:hAnsi="Arial" w:cs="Arial"/>
+          <w:sz w:val="20"/>
+          <w:szCs w:val="20"/>
+          <w:lang w:val="es-CL"/>
+        </w:rPr>
+        <w:t>Out</w:t>
+      </w:r>
+      <w:proofErr w:type="spellEnd"/>
+      <w:r>
+        <w:rPr>
+          <w:rFonts w:ascii="Arial" w:hAnsi="Arial" w:cs="Arial"/>
+          <w:sz w:val="20"/>
+          <w:szCs w:val="20"/>
+          <w:lang w:val="es-CL"/>
+        </w:rPr>
+        <w:t xml:space="preserve"> </w:t>
+      </w:r>
+      <w:proofErr w:type="spellStart"/>
+      <w:r>
+        <w:rPr>
+          <w:rFonts w:ascii="Arial" w:hAnsi="Arial" w:cs="Arial"/>
+          <w:sz w:val="20"/>
+          <w:szCs w:val="20"/>
+          <w:lang w:val="es-CL"/>
+        </w:rPr>
+        <w:t>of</w:t>
+      </w:r>
+      <w:proofErr w:type="spellEnd"/>
+      <w:r>
+        <w:rPr>
+          <w:rFonts w:ascii="Arial" w:hAnsi="Arial" w:cs="Arial"/>
+          <w:sz w:val="20"/>
+          <w:szCs w:val="20"/>
+          <w:lang w:val="es-CL"/>
+        </w:rPr>
+        <w:t xml:space="preserve"> </w:t>
+      </w:r>
+      <w:proofErr w:type="spellStart"/>
+      <w:r>
+        <w:rPr>
+          <w:rFonts w:ascii="Arial" w:hAnsi="Arial" w:cs="Arial"/>
+          <w:sz w:val="20"/>
+          <w:szCs w:val="20"/>
+          <w:lang w:val="es-CL"/>
+        </w:rPr>
+        <w:t>scope</w:t>
+      </w:r>
+      <w:proofErr w:type="spellEnd"/>
+      <w:r>
+        <w:rPr>
+          <w:rFonts w:ascii="Arial" w:hAnsi="Arial" w:cs="Arial"/>
+          <w:sz w:val="20"/>
+          <w:szCs w:val="20"/>
+          <w:lang w:val="es-CL"/>
+        </w:rPr>
+        <w:t>) en esta versión:</w:t>
       </w:r>
     </w:p>
     <w:p>
@@ -6714,7 +6956,27 @@
           <w:szCs w:val="20"/>
           <w:lang w:val="es-CL"/>
         </w:rPr>
-        <w:t>Procesos de venta/checkout, carritos o pasarelas de pago.</w:t>
+        <w:t>Procesos de venta/</w:t>
+      </w:r>
+      <w:proofErr w:type="spellStart"/>
+      <w:r>
+        <w:rPr>
+          <w:rFonts w:ascii="Arial" w:hAnsi="Arial" w:cs="Arial"/>
+          <w:sz w:val="20"/>
+          <w:szCs w:val="20"/>
+          <w:lang w:val="es-CL"/>
+        </w:rPr>
+        <w:t>checkout</w:t>
+      </w:r>
+      <w:proofErr w:type="spellEnd"/>
+      <w:r>
+        <w:rPr>
+          <w:rFonts w:ascii="Arial" w:hAnsi="Arial" w:cs="Arial"/>
+          <w:sz w:val="20"/>
+          <w:szCs w:val="20"/>
+          <w:lang w:val="es-CL"/>
+        </w:rPr>
+        <w:t>, carritos o pasarelas de pago.</w:t>
       </w:r>
     </w:p>
     <w:p>
@@ -6770,7 +7032,27 @@
           <w:szCs w:val="20"/>
           <w:lang w:val="es-CL"/>
         </w:rPr>
-        <w:t>Integraciones comerciales con retailers más allá de enlaces externos informativos.</w:t>
+        <w:t xml:space="preserve">Integraciones comerciales con </w:t>
+      </w:r>
+      <w:proofErr w:type="spellStart"/>
+      <w:r>
+        <w:rPr>
+          <w:rFonts w:ascii="Arial" w:hAnsi="Arial" w:cs="Arial"/>
+          <w:sz w:val="20"/>
+          <w:szCs w:val="20"/>
+          <w:lang w:val="es-CL"/>
+        </w:rPr>
+        <w:t>retailers</w:t>
+      </w:r>
+      <w:proofErr w:type="spellEnd"/>
+      <w:r>
+        <w:rPr>
+          <w:rFonts w:ascii="Arial" w:hAnsi="Arial" w:cs="Arial"/>
+          <w:sz w:val="20"/>
+          <w:szCs w:val="20"/>
+          <w:lang w:val="es-CL"/>
+        </w:rPr>
+        <w:t xml:space="preserve"> más allá de enlaces externos informativos.</w:t>
       </w:r>
     </w:p>
     <w:p>
@@ -6798,7 +7080,27 @@
           <w:szCs w:val="20"/>
           <w:lang w:val="es-CL"/>
         </w:rPr>
-        <w:t>Soporte técnico postcompra o servicio de reparación.</w:t>
+        <w:t xml:space="preserve">Soporte técnico </w:t>
+      </w:r>
+      <w:proofErr w:type="spellStart"/>
+      <w:r>
+        <w:rPr>
+          <w:rFonts w:ascii="Arial" w:hAnsi="Arial" w:cs="Arial"/>
+          <w:sz w:val="20"/>
+          <w:szCs w:val="20"/>
+          <w:lang w:val="es-CL"/>
+        </w:rPr>
+        <w:t>postcompra</w:t>
+      </w:r>
+      <w:proofErr w:type="spellEnd"/>
+      <w:r>
+        <w:rPr>
+          <w:rFonts w:ascii="Arial" w:hAnsi="Arial" w:cs="Arial"/>
+          <w:sz w:val="20"/>
+          <w:szCs w:val="20"/>
+          <w:lang w:val="es-CL"/>
+        </w:rPr>
+        <w:t xml:space="preserve"> o servicio de reparación.</w:t>
       </w:r>
     </w:p>
     <w:p>
@@ -7027,7 +7329,27 @@
           <w:szCs w:val="20"/>
           <w:lang w:val="es-CL"/>
         </w:rPr>
-        <w:t>Contenido vivo y confiable, gracias a revisión continua y feedback.</w:t>
+        <w:t xml:space="preserve">Contenido vivo y confiable, gracias a revisión continua y </w:t>
+      </w:r>
+      <w:proofErr w:type="spellStart"/>
+      <w:r>
+        <w:rPr>
+          <w:rFonts w:ascii="Arial" w:hAnsi="Arial" w:cs="Arial"/>
+          <w:sz w:val="20"/>
+          <w:szCs w:val="20"/>
+          <w:lang w:val="es-CL"/>
+        </w:rPr>
+        <w:t>feedback</w:t>
+      </w:r>
+      <w:proofErr w:type="spellEnd"/>
+      <w:r>
+        <w:rPr>
+          <w:rFonts w:ascii="Arial" w:hAnsi="Arial" w:cs="Arial"/>
+          <w:sz w:val="20"/>
+          <w:szCs w:val="20"/>
+          <w:lang w:val="es-CL"/>
+        </w:rPr>
+        <w:t>.</w:t>
       </w:r>
     </w:p>
     <w:p>
@@ -7286,7 +7608,67 @@
                 <w:sz w:val="20"/>
                 <w:szCs w:val="20"/>
               </w:rPr>
-              <w:t>Time to First Recommendation: tiempo desde que el usuario entra hasta que ve la primera sugerencia.</w:t>
+              <w:t xml:space="preserve">Time </w:t>
+            </w:r>
+            <w:proofErr w:type="spellStart"/>
+            <w:r>
+              <w:rPr>
+                <w:rFonts w:ascii="Arial" w:hAnsi="Arial" w:cs="Arial"/>
+                <w:iCs/>
+                <w:sz w:val="20"/>
+                <w:szCs w:val="20"/>
+              </w:rPr>
+              <w:t>to</w:t>
+            </w:r>
+            <w:proofErr w:type="spellEnd"/>
+            <w:r>
+              <w:rPr>
+                <w:rFonts w:ascii="Arial" w:hAnsi="Arial" w:cs="Arial"/>
+                <w:iCs/>
+                <w:sz w:val="20"/>
+                <w:szCs w:val="20"/>
+              </w:rPr>
+              <w:t xml:space="preserve"> </w:t>
+            </w:r>
+            <w:proofErr w:type="spellStart"/>
+            <w:r>
+              <w:rPr>
+                <w:rFonts w:ascii="Arial" w:hAnsi="Arial" w:cs="Arial"/>
+                <w:iCs/>
+                <w:sz w:val="20"/>
+                <w:szCs w:val="20"/>
+              </w:rPr>
+              <w:t>First</w:t>
+            </w:r>
+            <w:proofErr w:type="spellEnd"/>
+            <w:r>
+              <w:rPr>
+                <w:rFonts w:ascii="Arial" w:hAnsi="Arial" w:cs="Arial"/>
+                <w:iCs/>
+                <w:sz w:val="20"/>
+                <w:szCs w:val="20"/>
+              </w:rPr>
+              <w:t xml:space="preserve"> </w:t>
+            </w:r>
+            <w:proofErr w:type="spellStart"/>
+            <w:r>
+              <w:rPr>
+                <w:rFonts w:ascii="Arial" w:hAnsi="Arial" w:cs="Arial"/>
+                <w:iCs/>
+                <w:sz w:val="20"/>
+                <w:szCs w:val="20"/>
+              </w:rPr>
+              <w:t>Recommendation</w:t>
+            </w:r>
+            <w:proofErr w:type="spellEnd"/>
+            <w:r>
+              <w:rPr>
+                <w:rFonts w:ascii="Arial" w:hAnsi="Arial" w:cs="Arial"/>
+                <w:iCs/>
+                <w:sz w:val="20"/>
+                <w:szCs w:val="20"/>
+              </w:rPr>
+              <w:t>: tiempo desde que el usuario entra hasta que ve la primera sugerencia.</w:t>
             </w:r>
           </w:p>
         </w:tc>
@@ -7338,6 +7720,8 @@
                 <w:szCs w:val="20"/>
               </w:rPr>
             </w:pPr>
+            <w:proofErr w:type="spellStart"/>
+            <w:proofErr w:type="gramStart"/>
             <w:r>
               <w:rPr>
                 <w:rFonts w:ascii="Arial" w:hAnsi="Arial" w:cs="Arial"/>
@@ -7345,7 +7729,58 @@
                 <w:sz w:val="20"/>
                 <w:szCs w:val="20"/>
               </w:rPr>
-              <w:t>Click Through Rate: indicador de interacción con las recomendaciones.</w:t>
+              <w:t>Click</w:t>
+            </w:r>
+            <w:proofErr w:type="spellEnd"/>
+            <w:proofErr w:type="gramEnd"/>
+            <w:r>
+              <w:rPr>
+                <w:rFonts w:ascii="Arial" w:hAnsi="Arial" w:cs="Arial"/>
+                <w:iCs/>
+                <w:sz w:val="20"/>
+                <w:szCs w:val="20"/>
+              </w:rPr>
+              <w:t xml:space="preserve"> </w:t>
+            </w:r>
+            <w:proofErr w:type="spellStart"/>
+            <w:r>
+              <w:rPr>
+                <w:rFonts w:ascii="Arial" w:hAnsi="Arial" w:cs="Arial"/>
+                <w:iCs/>
+                <w:sz w:val="20"/>
+                <w:szCs w:val="20"/>
+              </w:rPr>
+              <w:t>Through</w:t>
+            </w:r>
+            <w:proofErr w:type="spellEnd"/>
+            <w:r>
+              <w:rPr>
+                <w:rFonts w:ascii="Arial" w:hAnsi="Arial" w:cs="Arial"/>
+                <w:iCs/>
+                <w:sz w:val="20"/>
+                <w:szCs w:val="20"/>
+              </w:rPr>
+              <w:t xml:space="preserve"> </w:t>
+            </w:r>
+            <w:proofErr w:type="spellStart"/>
+            <w:r>
+              <w:rPr>
+                <w:rFonts w:ascii="Arial" w:hAnsi="Arial" w:cs="Arial"/>
+                <w:iCs/>
+                <w:sz w:val="20"/>
+                <w:szCs w:val="20"/>
+              </w:rPr>
+              <w:t>Rate</w:t>
+            </w:r>
+            <w:proofErr w:type="spellEnd"/>
+            <w:r>
+              <w:rPr>
+                <w:rFonts w:ascii="Arial" w:hAnsi="Arial" w:cs="Arial"/>
+                <w:iCs/>
+                <w:sz w:val="20"/>
+                <w:szCs w:val="20"/>
+              </w:rPr>
+              <w:t>: indicador de interacción con las recomendaciones.</w:t>
             </w:r>
           </w:p>
         </w:tc>
@@ -7369,6 +7804,7 @@
                 <w:szCs w:val="20"/>
               </w:rPr>
             </w:pPr>
+            <w:proofErr w:type="spellStart"/>
             <w:r>
               <w:rPr>
                 <w:rFonts w:ascii="Arial" w:hAnsi="Arial" w:cs="Arial"/>
@@ -7379,6 +7815,7 @@
               </w:rPr>
               <w:t>Build</w:t>
             </w:r>
+            <w:proofErr w:type="spellEnd"/>
           </w:p>
         </w:tc>
         <w:tc>
@@ -7460,7 +7897,27 @@
                 <w:sz w:val="20"/>
                 <w:szCs w:val="20"/>
               </w:rPr>
-              <w:t>Segmento de uso (Gamer, Hogar, Estudio, Trabajo/Diseño) que condiciona reglas.</w:t>
+              <w:t>Segmento de uso (</w:t>
+            </w:r>
+            <w:proofErr w:type="spellStart"/>
+            <w:r>
+              <w:rPr>
+                <w:rFonts w:ascii="Arial" w:hAnsi="Arial" w:cs="Arial"/>
+                <w:iCs/>
+                <w:sz w:val="20"/>
+                <w:szCs w:val="20"/>
+              </w:rPr>
+              <w:t>Gamer</w:t>
+            </w:r>
+            <w:proofErr w:type="spellEnd"/>
+            <w:r>
+              <w:rPr>
+                <w:rFonts w:ascii="Arial" w:hAnsi="Arial" w:cs="Arial"/>
+                <w:iCs/>
+                <w:sz w:val="20"/>
+                <w:szCs w:val="20"/>
+              </w:rPr>
+              <w:t>, Hogar, Estudio, Trabajo/Diseño) que condiciona reglas.</w:t>
             </w:r>
           </w:p>
         </w:tc>
@@ -7544,6 +8001,7 @@
                 <w:szCs w:val="20"/>
               </w:rPr>
             </w:pPr>
+            <w:proofErr w:type="spellStart"/>
             <w:r>
               <w:rPr>
                 <w:rFonts w:ascii="Arial" w:hAnsi="Arial" w:cs="Arial"/>
@@ -7551,7 +8009,17 @@
                 <w:sz w:val="20"/>
                 <w:szCs w:val="20"/>
               </w:rPr>
-              <w:t>Admin/Editor</w:t>
+              <w:t>Admin</w:t>
+            </w:r>
+            <w:proofErr w:type="spellEnd"/>
+            <w:r>
+              <w:rPr>
+                <w:rFonts w:ascii="Arial" w:hAnsi="Arial" w:cs="Arial"/>
+                <w:iCs/>
+                <w:sz w:val="20"/>
+                <w:szCs w:val="20"/>
+              </w:rPr>
+              <w:t>/Editor</w:t>
             </w:r>
           </w:p>
         </w:tc>
@@ -7602,6 +8070,7 @@
                 <w:szCs w:val="20"/>
               </w:rPr>
             </w:pPr>
+            <w:proofErr w:type="spellStart"/>
             <w:r>
               <w:rPr>
                 <w:rFonts w:ascii="Arial" w:hAnsi="Arial" w:cs="Arial"/>
@@ -7611,6 +8080,7 @@
               </w:rPr>
               <w:t>Recomendador</w:t>
             </w:r>
+            <w:proofErr w:type="spellEnd"/>
           </w:p>
         </w:tc>
         <w:tc>
@@ -7635,8 +8105,19 @@
                 <w:sz w:val="20"/>
                 <w:szCs w:val="20"/>
               </w:rPr>
-              <w:t>Módulo que aplica preferencias + compatibilidad + presupuesto para rankear</w:t>
-            </w:r>
+              <w:t xml:space="preserve">Módulo que aplica preferencias + compatibilidad + presupuesto para </w:t>
+            </w:r>
+            <w:proofErr w:type="spellStart"/>
+            <w:r>
+              <w:rPr>
+                <w:rFonts w:ascii="Arial" w:hAnsi="Arial" w:cs="Arial"/>
+                <w:iCs/>
+                <w:sz w:val="20"/>
+                <w:szCs w:val="20"/>
+              </w:rPr>
+              <w:t>rankear</w:t>
+            </w:r>
+            <w:proofErr w:type="spellEnd"/>
           </w:p>
         </w:tc>
       </w:tr>
@@ -8248,13 +8729,41 @@
           <w:szCs w:val="20"/>
         </w:rPr>
       </w:pPr>
-      <w:r>
-        <w:rPr>
-          <w:rFonts w:ascii="Arial" w:hAnsi="Arial" w:cs="Arial"/>
-          <w:sz w:val="20"/>
-          <w:szCs w:val="20"/>
-        </w:rPr>
-        <w:t>MiPC Ideal es una web que ayuda a elegir bien hardware de PC/notebooks/Tablets sin ser experto. Traduce especificaciones a usos reales y sugiere opciones compatibles y acordes al presupuesto. No vende; orienta.</w:t>
+      <w:proofErr w:type="spellStart"/>
+      <w:r>
+        <w:rPr>
+          <w:rFonts w:ascii="Arial" w:hAnsi="Arial" w:cs="Arial"/>
+          <w:sz w:val="20"/>
+          <w:szCs w:val="20"/>
+        </w:rPr>
+        <w:t>MiPC</w:t>
+      </w:r>
+      <w:proofErr w:type="spellEnd"/>
+      <w:r>
+        <w:rPr>
+          <w:rFonts w:ascii="Arial" w:hAnsi="Arial" w:cs="Arial"/>
+          <w:sz w:val="20"/>
+          <w:szCs w:val="20"/>
+        </w:rPr>
+        <w:t xml:space="preserve"> Ideal es una web que ayuda a elegir bien hardware de PC/notebooks/</w:t>
+      </w:r>
+      <w:proofErr w:type="spellStart"/>
+      <w:r>
+        <w:rPr>
+          <w:rFonts w:ascii="Arial" w:hAnsi="Arial" w:cs="Arial"/>
+          <w:sz w:val="20"/>
+          <w:szCs w:val="20"/>
+        </w:rPr>
+        <w:t>Tablets</w:t>
+      </w:r>
+      <w:proofErr w:type="spellEnd"/>
+      <w:r>
+        <w:rPr>
+          <w:rFonts w:ascii="Arial" w:hAnsi="Arial" w:cs="Arial"/>
+          <w:sz w:val="20"/>
+          <w:szCs w:val="20"/>
+        </w:rPr>
+        <w:t xml:space="preserve"> sin ser experto. Traduce especificaciones a usos reales y sugiere opciones compatibles y acordes al presupuesto. No vende; orienta.</w:t>
       </w:r>
     </w:p>
     <w:p>
@@ -8435,7 +8944,43 @@
           <w:sz w:val="20"/>
           <w:szCs w:val="20"/>
         </w:rPr>
-        <w:t>Conclusión: el enfoque de MiPC Ideal cubre un vacío entre la publicidad y la venta: brinda orientación imparcial con base técnica y una experiencia clara, escalable a más categorías y perfiles sin convertirse en e-commerce.</w:t>
+        <w:t xml:space="preserve">Conclusión: el enfoque de </w:t>
+      </w:r>
+      <w:proofErr w:type="spellStart"/>
+      <w:r>
+        <w:rPr>
+          <w:rFonts w:ascii="Arial" w:hAnsi="Arial" w:cs="Arial"/>
+          <w:sz w:val="20"/>
+          <w:szCs w:val="20"/>
+        </w:rPr>
+        <w:t>MiPC</w:t>
+      </w:r>
+      <w:proofErr w:type="spellEnd"/>
+      <w:r>
+        <w:rPr>
+          <w:rFonts w:ascii="Arial" w:hAnsi="Arial" w:cs="Arial"/>
+          <w:sz w:val="20"/>
+          <w:szCs w:val="20"/>
+        </w:rPr>
+        <w:t xml:space="preserve"> Ideal cubre un vacío entre la publicidad y la venta: brinda orientación imparcial con base técnica y una experiencia clara, escalable a más categorías y perfiles sin convertirse en e-</w:t>
+      </w:r>
+      <w:proofErr w:type="spellStart"/>
+      <w:r>
+        <w:rPr>
+          <w:rFonts w:ascii="Arial" w:hAnsi="Arial" w:cs="Arial"/>
+          <w:sz w:val="20"/>
+          <w:szCs w:val="20"/>
+        </w:rPr>
+        <w:t>commerce</w:t>
+      </w:r>
+      <w:proofErr w:type="spellEnd"/>
+      <w:r>
+        <w:rPr>
+          <w:rFonts w:ascii="Arial" w:hAnsi="Arial" w:cs="Arial"/>
+          <w:sz w:val="20"/>
+          <w:szCs w:val="20"/>
+        </w:rPr>
+        <w:t>.</w:t>
       </w:r>
     </w:p>
     <w:p>
@@ -8652,7 +9197,27 @@
           <w:szCs w:val="20"/>
           <w:lang w:val="es-CL"/>
         </w:rPr>
-        <w:t>Comparar productos/builds → pros/contras.</w:t>
+        <w:t>Comparar productos/</w:t>
+      </w:r>
+      <w:proofErr w:type="spellStart"/>
+      <w:r>
+        <w:rPr>
+          <w:rFonts w:ascii="Arial" w:hAnsi="Arial" w:cs="Arial"/>
+          <w:sz w:val="20"/>
+          <w:szCs w:val="20"/>
+          <w:lang w:val="es-CL"/>
+        </w:rPr>
+        <w:t>builds</w:t>
+      </w:r>
+      <w:proofErr w:type="spellEnd"/>
+      <w:r>
+        <w:rPr>
+          <w:rFonts w:ascii="Arial" w:hAnsi="Arial" w:cs="Arial"/>
+          <w:sz w:val="20"/>
+          <w:szCs w:val="20"/>
+          <w:lang w:val="es-CL"/>
+        </w:rPr>
+        <w:t xml:space="preserve"> → pros/contras.</w:t>
       </w:r>
     </w:p>
     <w:p>
@@ -8681,7 +9246,27 @@
           <w:szCs w:val="20"/>
           <w:lang w:val="es-CL"/>
         </w:rPr>
-        <w:t>Reportar contenido → admin modera.</w:t>
+        <w:t xml:space="preserve">Reportar contenido → </w:t>
+      </w:r>
+      <w:proofErr w:type="spellStart"/>
+      <w:r>
+        <w:rPr>
+          <w:rFonts w:ascii="Arial" w:hAnsi="Arial" w:cs="Arial"/>
+          <w:sz w:val="20"/>
+          <w:szCs w:val="20"/>
+          <w:lang w:val="es-CL"/>
+        </w:rPr>
+        <w:t>admin</w:t>
+      </w:r>
+      <w:proofErr w:type="spellEnd"/>
+      <w:r>
+        <w:rPr>
+          <w:rFonts w:ascii="Arial" w:hAnsi="Arial" w:cs="Arial"/>
+          <w:sz w:val="20"/>
+          <w:szCs w:val="20"/>
+          <w:lang w:val="es-CL"/>
+        </w:rPr>
+        <w:t xml:space="preserve"> modera.</w:t>
       </w:r>
     </w:p>
     <w:p>
@@ -8710,7 +9295,27 @@
           <w:szCs w:val="20"/>
           <w:lang w:val="es-CL"/>
         </w:rPr>
-        <w:t>Administrar catálogo (admin) → alta/baja/edición y cierre de reportes.</w:t>
+        <w:t>Administrar catálogo (</w:t>
+      </w:r>
+      <w:proofErr w:type="spellStart"/>
+      <w:r>
+        <w:rPr>
+          <w:rFonts w:ascii="Arial" w:hAnsi="Arial" w:cs="Arial"/>
+          <w:sz w:val="20"/>
+          <w:szCs w:val="20"/>
+          <w:lang w:val="es-CL"/>
+        </w:rPr>
+        <w:t>admin</w:t>
+      </w:r>
+      <w:proofErr w:type="spellEnd"/>
+      <w:r>
+        <w:rPr>
+          <w:rFonts w:ascii="Arial" w:hAnsi="Arial" w:cs="Arial"/>
+          <w:sz w:val="20"/>
+          <w:szCs w:val="20"/>
+          <w:lang w:val="es-CL"/>
+        </w:rPr>
+        <w:t>) → alta/baja/edición y cierre de reportes.</w:t>
       </w:r>
     </w:p>
     <w:p>
@@ -8821,7 +9426,27 @@
           <w:szCs w:val="20"/>
           <w:lang w:val="es-CL"/>
         </w:rPr>
-        <w:t>95% builds sugeridas sin conflicto (correctitud).</w:t>
+        <w:t xml:space="preserve">95% </w:t>
+      </w:r>
+      <w:proofErr w:type="spellStart"/>
+      <w:r>
+        <w:rPr>
+          <w:rFonts w:ascii="Arial" w:hAnsi="Arial" w:cs="Arial"/>
+          <w:sz w:val="20"/>
+          <w:szCs w:val="20"/>
+          <w:lang w:val="es-CL"/>
+        </w:rPr>
+        <w:t>builds</w:t>
+      </w:r>
+      <w:proofErr w:type="spellEnd"/>
+      <w:r>
+        <w:rPr>
+          <w:rFonts w:ascii="Arial" w:hAnsi="Arial" w:cs="Arial"/>
+          <w:sz w:val="20"/>
+          <w:szCs w:val="20"/>
+          <w:lang w:val="es-CL"/>
+        </w:rPr>
+        <w:t xml:space="preserve"> sugeridas sin conflicto (correctitud).</w:t>
       </w:r>
     </w:p>
     <w:p>
@@ -8957,7 +9582,27 @@
           <w:szCs w:val="20"/>
           <w:lang w:val="es-CL"/>
         </w:rPr>
-        <w:t>Módulos: Catálogo, Perfiles &amp; Preferencias, Motor de Recomendación, Compatibilidad, Moderación &amp; Reportes, Métricas/Analytics, Presentación (UI).</w:t>
+        <w:t>Módulos: Catálogo, Perfiles &amp; Preferencias, Motor de Recomendación, Compatibilidad, Moderación &amp; Reportes, Métricas/</w:t>
+      </w:r>
+      <w:proofErr w:type="spellStart"/>
+      <w:r>
+        <w:rPr>
+          <w:rFonts w:ascii="Arial" w:hAnsi="Arial" w:cs="Arial"/>
+          <w:sz w:val="20"/>
+          <w:szCs w:val="20"/>
+          <w:lang w:val="es-CL"/>
+        </w:rPr>
+        <w:t>Analytics</w:t>
+      </w:r>
+      <w:proofErr w:type="spellEnd"/>
+      <w:r>
+        <w:rPr>
+          <w:rFonts w:ascii="Arial" w:hAnsi="Arial" w:cs="Arial"/>
+          <w:sz w:val="20"/>
+          <w:szCs w:val="20"/>
+          <w:lang w:val="es-CL"/>
+        </w:rPr>
+        <w:t>, Presentación (UI).</w:t>
       </w:r>
     </w:p>
     <w:p>
@@ -8986,8 +9631,49 @@
           <w:szCs w:val="20"/>
           <w:lang w:val="es-CL"/>
         </w:rPr>
-        <w:t xml:space="preserve">Entidades clave: Producto, CategoriaProducto, ProductReview, </w:t>
-      </w:r>
+        <w:t xml:space="preserve">Entidades clave: Producto, </w:t>
+      </w:r>
+      <w:proofErr w:type="spellStart"/>
+      <w:r>
+        <w:rPr>
+          <w:rFonts w:ascii="Arial" w:hAnsi="Arial" w:cs="Arial"/>
+          <w:sz w:val="20"/>
+          <w:szCs w:val="20"/>
+          <w:lang w:val="es-CL"/>
+        </w:rPr>
+        <w:t>CategoriaProducto</w:t>
+      </w:r>
+      <w:proofErr w:type="spellEnd"/>
+      <w:r>
+        <w:rPr>
+          <w:rFonts w:ascii="Arial" w:hAnsi="Arial" w:cs="Arial"/>
+          <w:sz w:val="20"/>
+          <w:szCs w:val="20"/>
+          <w:lang w:val="es-CL"/>
+        </w:rPr>
+        <w:t xml:space="preserve">, </w:t>
+      </w:r>
+      <w:proofErr w:type="spellStart"/>
+      <w:r>
+        <w:rPr>
+          <w:rFonts w:ascii="Arial" w:hAnsi="Arial" w:cs="Arial"/>
+          <w:sz w:val="20"/>
+          <w:szCs w:val="20"/>
+          <w:lang w:val="es-CL"/>
+        </w:rPr>
+        <w:t>ProductReview</w:t>
+      </w:r>
+      <w:proofErr w:type="spellEnd"/>
+      <w:r>
+        <w:rPr>
+          <w:rFonts w:ascii="Arial" w:hAnsi="Arial" w:cs="Arial"/>
+          <w:sz w:val="20"/>
+          <w:szCs w:val="20"/>
+          <w:lang w:val="es-CL"/>
+        </w:rPr>
+        <w:t xml:space="preserve">, </w:t>
+      </w:r>
+      <w:proofErr w:type="spellStart"/>
       <w:r>
         <w:rPr>
           <w:rFonts w:ascii="Arial" w:hAnsi="Arial" w:cs="Arial"/>
@@ -8996,6 +9682,7 @@
         </w:rPr>
         <w:t>ProductReference</w:t>
       </w:r>
+      <w:proofErr w:type="spellEnd"/>
       <w:r>
         <w:rPr>
           <w:rFonts w:ascii="Arial" w:hAnsi="Arial" w:cs="Arial"/>
@@ -9005,6 +9692,7 @@
         </w:rPr>
         <w:t xml:space="preserve">, </w:t>
       </w:r>
+      <w:proofErr w:type="spellStart"/>
       <w:r>
         <w:rPr>
           <w:rFonts w:ascii="Arial" w:hAnsi="Arial" w:cs="Arial"/>
@@ -9013,6 +9701,7 @@
         </w:rPr>
         <w:t>ReferenceVisit</w:t>
       </w:r>
+      <w:proofErr w:type="spellEnd"/>
       <w:r>
         <w:rPr>
           <w:rFonts w:ascii="Arial" w:hAnsi="Arial" w:cs="Arial"/>
@@ -9022,6 +9711,7 @@
         </w:rPr>
         <w:t xml:space="preserve">, </w:t>
       </w:r>
+      <w:proofErr w:type="spellStart"/>
       <w:r>
         <w:rPr>
           <w:rFonts w:ascii="Arial" w:hAnsi="Arial" w:cs="Arial"/>
@@ -9030,6 +9720,7 @@
         </w:rPr>
         <w:t>UserViewStat</w:t>
       </w:r>
+      <w:proofErr w:type="spellEnd"/>
       <w:r>
         <w:rPr>
           <w:rFonts w:ascii="Arial" w:hAnsi="Arial" w:cs="Arial"/>
@@ -9244,7 +9935,47 @@
           <w:szCs w:val="20"/>
           <w:lang w:val="en-US"/>
         </w:rPr>
-        <w:t>Backend Django (MVT) + ORM; endpoints ligeros para UI.</w:t>
+        <w:t xml:space="preserve">Backend Django (MVT) + ORM; endpoints </w:t>
+      </w:r>
+      <w:proofErr w:type="spellStart"/>
+      <w:r>
+        <w:rPr>
+          <w:rFonts w:ascii="Arial" w:hAnsi="Arial" w:cs="Arial"/>
+          <w:sz w:val="20"/>
+          <w:szCs w:val="20"/>
+          <w:lang w:val="en-US"/>
+        </w:rPr>
+        <w:t>ligeros</w:t>
+      </w:r>
+      <w:proofErr w:type="spellEnd"/>
+      <w:r>
+        <w:rPr>
+          <w:rFonts w:ascii="Arial" w:hAnsi="Arial" w:cs="Arial"/>
+          <w:sz w:val="20"/>
+          <w:szCs w:val="20"/>
+          <w:lang w:val="en-US"/>
+        </w:rPr>
+        <w:t xml:space="preserve"> </w:t>
+      </w:r>
+      <w:proofErr w:type="gramStart"/>
+      <w:r>
+        <w:rPr>
+          <w:rFonts w:ascii="Arial" w:hAnsi="Arial" w:cs="Arial"/>
+          <w:sz w:val="20"/>
+          <w:szCs w:val="20"/>
+          <w:lang w:val="en-US"/>
+        </w:rPr>
+        <w:t>para UI</w:t>
+      </w:r>
+      <w:proofErr w:type="gramEnd"/>
+      <w:r>
+        <w:rPr>
+          <w:rFonts w:ascii="Arial" w:hAnsi="Arial" w:cs="Arial"/>
+          <w:sz w:val="20"/>
+          <w:szCs w:val="20"/>
+          <w:lang w:val="en-US"/>
+        </w:rPr>
+        <w:t>.</w:t>
       </w:r>
     </w:p>
     <w:p>
@@ -9302,7 +10033,27 @@
           <w:szCs w:val="20"/>
           <w:lang w:val="es-CL"/>
         </w:rPr>
-        <w:t>Plantillas Django (o React más adelante) con componentes reusables.</w:t>
+        <w:t xml:space="preserve">Plantillas Django (o </w:t>
+      </w:r>
+      <w:proofErr w:type="spellStart"/>
+      <w:r>
+        <w:rPr>
+          <w:rFonts w:ascii="Arial" w:hAnsi="Arial" w:cs="Arial"/>
+          <w:sz w:val="20"/>
+          <w:szCs w:val="20"/>
+          <w:lang w:val="es-CL"/>
+        </w:rPr>
+        <w:t>React</w:t>
+      </w:r>
+      <w:proofErr w:type="spellEnd"/>
+      <w:r>
+        <w:rPr>
+          <w:rFonts w:ascii="Arial" w:hAnsi="Arial" w:cs="Arial"/>
+          <w:sz w:val="20"/>
+          <w:szCs w:val="20"/>
+          <w:lang w:val="es-CL"/>
+        </w:rPr>
+        <w:t xml:space="preserve"> más adelante) con componentes reusables.</w:t>
       </w:r>
     </w:p>
     <w:p>
@@ -9426,7 +10177,27 @@
           <w:szCs w:val="20"/>
           <w:lang w:val="es-CL"/>
         </w:rPr>
-        <w:t>1 VM/contendor app + 1 DB + 1 caché (ej. Redis).</w:t>
+        <w:t xml:space="preserve">1 VM/contendor </w:t>
+      </w:r>
+      <w:proofErr w:type="gramStart"/>
+      <w:r>
+        <w:rPr>
+          <w:rFonts w:ascii="Arial" w:hAnsi="Arial" w:cs="Arial"/>
+          <w:sz w:val="20"/>
+          <w:szCs w:val="20"/>
+          <w:lang w:val="es-CL"/>
+        </w:rPr>
+        <w:t>app</w:t>
+      </w:r>
+      <w:proofErr w:type="gramEnd"/>
+      <w:r>
+        <w:rPr>
+          <w:rFonts w:ascii="Arial" w:hAnsi="Arial" w:cs="Arial"/>
+          <w:sz w:val="20"/>
+          <w:szCs w:val="20"/>
+          <w:lang w:val="es-CL"/>
+        </w:rPr>
+        <w:t xml:space="preserve"> + 1 DB + 1 caché (ej. Redis).</w:t>
       </w:r>
     </w:p>
     <w:p>
@@ -9477,14 +10248,25 @@
           <w:lang w:val="es-CL"/>
         </w:rPr>
       </w:pPr>
-      <w:r>
-        <w:rPr>
-          <w:rFonts w:ascii="Arial" w:hAnsi="Arial" w:cs="Arial"/>
-          <w:sz w:val="20"/>
-          <w:szCs w:val="20"/>
-          <w:lang w:val="es-CL"/>
-        </w:rPr>
-        <w:t>Backups DB programados.</w:t>
+      <w:proofErr w:type="spellStart"/>
+      <w:r>
+        <w:rPr>
+          <w:rFonts w:ascii="Arial" w:hAnsi="Arial" w:cs="Arial"/>
+          <w:sz w:val="20"/>
+          <w:szCs w:val="20"/>
+          <w:lang w:val="es-CL"/>
+        </w:rPr>
+        <w:t>Backups</w:t>
+      </w:r>
+      <w:proofErr w:type="spellEnd"/>
+      <w:r>
+        <w:rPr>
+          <w:rFonts w:ascii="Arial" w:hAnsi="Arial" w:cs="Arial"/>
+          <w:sz w:val="20"/>
+          <w:szCs w:val="20"/>
+          <w:lang w:val="es-CL"/>
+        </w:rPr>
+        <w:t xml:space="preserve"> DB programados.</w:t>
       </w:r>
     </w:p>
     <w:p>
@@ -9586,6 +10368,8 @@
         </w:rPr>
         <w:t xml:space="preserve">Usuario </w:t>
       </w:r>
+      <w:proofErr w:type="spellStart"/>
+      <w:proofErr w:type="gramStart"/>
       <w:r>
         <w:rPr>
           <w:rFonts w:ascii="Arial" w:hAnsi="Arial" w:cs="Arial"/>
@@ -9597,14 +10381,56 @@
         </w:rPr>
         <w:t>gamer</w:t>
       </w:r>
-      <w:r>
-        <w:rPr>
-          <w:rFonts w:ascii="Arial" w:hAnsi="Arial" w:cs="Arial"/>
-          <w:sz w:val="20"/>
-          <w:szCs w:val="20"/>
-          <w:lang w:val="es-CL"/>
-        </w:rPr>
-        <w:t xml:space="preserve"> entra → ajusta preferencias → motor sugiere 4 caminos (Básico / Económico, Gama Media, Alto Rendimiento, Premium) → ve compatibilidad y razón de cada elección → marca “guardar” o reporta(denuncia) info incorrecta → admin revisa y cierra incidencia.</w:t>
+      <w:proofErr w:type="spellEnd"/>
+      <w:proofErr w:type="gramEnd"/>
+      <w:r>
+        <w:rPr>
+          <w:rFonts w:ascii="Arial" w:hAnsi="Arial" w:cs="Arial"/>
+          <w:sz w:val="20"/>
+          <w:szCs w:val="20"/>
+          <w:lang w:val="es-CL"/>
+        </w:rPr>
+        <w:t xml:space="preserve"> entra → ajusta preferencias → motor sugiere 4 caminos (Básico / Económico, Gama Media, Alto Rendimiento, Premium) → ve compatibilidad y razón de cada elección → marca “guardar” o reporta(denuncia) </w:t>
+      </w:r>
+      <w:proofErr w:type="spellStart"/>
+      <w:r>
+        <w:rPr>
+          <w:rFonts w:ascii="Arial" w:hAnsi="Arial" w:cs="Arial"/>
+          <w:sz w:val="20"/>
+          <w:szCs w:val="20"/>
+          <w:lang w:val="es-CL"/>
+        </w:rPr>
+        <w:t>info</w:t>
+      </w:r>
+      <w:proofErr w:type="spellEnd"/>
+      <w:r>
+        <w:rPr>
+          <w:rFonts w:ascii="Arial" w:hAnsi="Arial" w:cs="Arial"/>
+          <w:sz w:val="20"/>
+          <w:szCs w:val="20"/>
+          <w:lang w:val="es-CL"/>
+        </w:rPr>
+        <w:t xml:space="preserve"> incorrecta → </w:t>
+      </w:r>
+      <w:proofErr w:type="spellStart"/>
+      <w:r>
+        <w:rPr>
+          <w:rFonts w:ascii="Arial" w:hAnsi="Arial" w:cs="Arial"/>
+          <w:sz w:val="20"/>
+          <w:szCs w:val="20"/>
+          <w:lang w:val="es-CL"/>
+        </w:rPr>
+        <w:t>admin</w:t>
+      </w:r>
+      <w:proofErr w:type="spellEnd"/>
+      <w:r>
+        <w:rPr>
+          <w:rFonts w:ascii="Arial" w:hAnsi="Arial" w:cs="Arial"/>
+          <w:sz w:val="20"/>
+          <w:szCs w:val="20"/>
+          <w:lang w:val="es-CL"/>
+        </w:rPr>
+        <w:t xml:space="preserve"> revisa y cierra incidencia.</w:t>
       </w:r>
     </w:p>
     <w:p>
@@ -10170,7 +10996,27 @@
           <w:szCs w:val="20"/>
           <w:lang w:val="es-CL"/>
         </w:rPr>
-        <w:t>Peso de página inicial: ≤ 300 KB críticos (lazy-load para el resto).</w:t>
+        <w:t>Peso de página inicial: ≤ 300 KB críticos (</w:t>
+      </w:r>
+      <w:proofErr w:type="spellStart"/>
+      <w:r>
+        <w:rPr>
+          <w:rFonts w:ascii="Arial" w:hAnsi="Arial" w:cs="Arial"/>
+          <w:sz w:val="20"/>
+          <w:szCs w:val="20"/>
+          <w:lang w:val="es-CL"/>
+        </w:rPr>
+        <w:t>lazy</w:t>
+      </w:r>
+      <w:proofErr w:type="spellEnd"/>
+      <w:r>
+        <w:rPr>
+          <w:rFonts w:ascii="Arial" w:hAnsi="Arial" w:cs="Arial"/>
+          <w:sz w:val="20"/>
+          <w:szCs w:val="20"/>
+          <w:lang w:val="es-CL"/>
+        </w:rPr>
+        <w:t>-load para el resto).</w:t>
       </w:r>
     </w:p>
     <w:p>
@@ -10198,7 +11044,27 @@
           <w:szCs w:val="20"/>
           <w:lang w:val="es-CL"/>
         </w:rPr>
-        <w:t>Caché para consultas frecuentes (categorías populares, builds base).</w:t>
+        <w:t xml:space="preserve">Caché para consultas frecuentes (categorías populares, </w:t>
+      </w:r>
+      <w:proofErr w:type="spellStart"/>
+      <w:r>
+        <w:rPr>
+          <w:rFonts w:ascii="Arial" w:hAnsi="Arial" w:cs="Arial"/>
+          <w:sz w:val="20"/>
+          <w:szCs w:val="20"/>
+          <w:lang w:val="es-CL"/>
+        </w:rPr>
+        <w:t>builds</w:t>
+      </w:r>
+      <w:proofErr w:type="spellEnd"/>
+      <w:r>
+        <w:rPr>
+          <w:rFonts w:ascii="Arial" w:hAnsi="Arial" w:cs="Arial"/>
+          <w:sz w:val="20"/>
+          <w:szCs w:val="20"/>
+          <w:lang w:val="es-CL"/>
+        </w:rPr>
+        <w:t xml:space="preserve"> base).</w:t>
       </w:r>
     </w:p>
     <w:p>
@@ -10302,7 +11168,27 @@
           <w:szCs w:val="20"/>
           <w:lang w:val="es-CL"/>
         </w:rPr>
-        <w:t>Degradación elegante: si el motor está lento, servir “recomendaciones seguras” precacheadas.</w:t>
+        <w:t xml:space="preserve">Degradación elegante: si el motor está lento, servir “recomendaciones seguras” </w:t>
+      </w:r>
+      <w:proofErr w:type="spellStart"/>
+      <w:r>
+        <w:rPr>
+          <w:rFonts w:ascii="Arial" w:hAnsi="Arial" w:cs="Arial"/>
+          <w:sz w:val="20"/>
+          <w:szCs w:val="20"/>
+          <w:lang w:val="es-CL"/>
+        </w:rPr>
+        <w:t>precacheadas</w:t>
+      </w:r>
+      <w:proofErr w:type="spellEnd"/>
+      <w:r>
+        <w:rPr>
+          <w:rFonts w:ascii="Arial" w:hAnsi="Arial" w:cs="Arial"/>
+          <w:sz w:val="20"/>
+          <w:szCs w:val="20"/>
+          <w:lang w:val="es-CL"/>
+        </w:rPr>
+        <w:t>.</w:t>
       </w:r>
     </w:p>
     <w:p>
@@ -10330,7 +11216,27 @@
           <w:szCs w:val="20"/>
           <w:lang w:val="es-CL"/>
         </w:rPr>
-        <w:t>Reintentos de red y timeouts controlados en llamadas a servicios.</w:t>
+        <w:t xml:space="preserve">Reintentos de red y </w:t>
+      </w:r>
+      <w:proofErr w:type="spellStart"/>
+      <w:r>
+        <w:rPr>
+          <w:rFonts w:ascii="Arial" w:hAnsi="Arial" w:cs="Arial"/>
+          <w:sz w:val="20"/>
+          <w:szCs w:val="20"/>
+          <w:lang w:val="es-CL"/>
+        </w:rPr>
+        <w:t>timeouts</w:t>
+      </w:r>
+      <w:proofErr w:type="spellEnd"/>
+      <w:r>
+        <w:rPr>
+          <w:rFonts w:ascii="Arial" w:hAnsi="Arial" w:cs="Arial"/>
+          <w:sz w:val="20"/>
+          <w:szCs w:val="20"/>
+          <w:lang w:val="es-CL"/>
+        </w:rPr>
+        <w:t xml:space="preserve"> controlados en llamadas a servicios.</w:t>
       </w:r>
     </w:p>
     <w:p>
@@ -10455,14 +11361,65 @@
           <w:lang w:val="es-CL"/>
         </w:rPr>
       </w:pPr>
-      <w:r>
-        <w:rPr>
-          <w:rFonts w:ascii="Arial" w:hAnsi="Arial" w:cs="Arial"/>
-          <w:sz w:val="20"/>
-          <w:szCs w:val="20"/>
-          <w:lang w:val="es-CL"/>
-        </w:rPr>
-        <w:t>Rate limiting básico en endpoints sensibles (recomendación, reportes).</w:t>
+      <w:proofErr w:type="spellStart"/>
+      <w:r>
+        <w:rPr>
+          <w:rFonts w:ascii="Arial" w:hAnsi="Arial" w:cs="Arial"/>
+          <w:sz w:val="20"/>
+          <w:szCs w:val="20"/>
+          <w:lang w:val="es-CL"/>
+        </w:rPr>
+        <w:t>Rate</w:t>
+      </w:r>
+      <w:proofErr w:type="spellEnd"/>
+      <w:r>
+        <w:rPr>
+          <w:rFonts w:ascii="Arial" w:hAnsi="Arial" w:cs="Arial"/>
+          <w:sz w:val="20"/>
+          <w:szCs w:val="20"/>
+          <w:lang w:val="es-CL"/>
+        </w:rPr>
+        <w:t xml:space="preserve"> </w:t>
+      </w:r>
+      <w:proofErr w:type="spellStart"/>
+      <w:r>
+        <w:rPr>
+          <w:rFonts w:ascii="Arial" w:hAnsi="Arial" w:cs="Arial"/>
+          <w:sz w:val="20"/>
+          <w:szCs w:val="20"/>
+          <w:lang w:val="es-CL"/>
+        </w:rPr>
+        <w:t>limiting</w:t>
+      </w:r>
+      <w:proofErr w:type="spellEnd"/>
+      <w:r>
+        <w:rPr>
+          <w:rFonts w:ascii="Arial" w:hAnsi="Arial" w:cs="Arial"/>
+          <w:sz w:val="20"/>
+          <w:szCs w:val="20"/>
+          <w:lang w:val="es-CL"/>
+        </w:rPr>
+        <w:t xml:space="preserve"> básico en </w:t>
+      </w:r>
+      <w:proofErr w:type="spellStart"/>
+      <w:r>
+        <w:rPr>
+          <w:rFonts w:ascii="Arial" w:hAnsi="Arial" w:cs="Arial"/>
+          <w:sz w:val="20"/>
+          <w:szCs w:val="20"/>
+          <w:lang w:val="es-CL"/>
+        </w:rPr>
+        <w:t>endpoints</w:t>
+      </w:r>
+      <w:proofErr w:type="spellEnd"/>
+      <w:r>
+        <w:rPr>
+          <w:rFonts w:ascii="Arial" w:hAnsi="Arial" w:cs="Arial"/>
+          <w:sz w:val="20"/>
+          <w:szCs w:val="20"/>
+          <w:lang w:val="es-CL"/>
+        </w:rPr>
+        <w:t xml:space="preserve"> sensibles (recomendación, reportes).</w:t>
       </w:r>
     </w:p>
     <w:p>
@@ -10490,7 +11447,27 @@
           <w:szCs w:val="20"/>
           <w:lang w:val="es-CL"/>
         </w:rPr>
-        <w:t>Auditoría de acciones de admin (cambios de catálogo, cierres de reporte).</w:t>
+        <w:t xml:space="preserve">Auditoría de acciones de </w:t>
+      </w:r>
+      <w:proofErr w:type="spellStart"/>
+      <w:r>
+        <w:rPr>
+          <w:rFonts w:ascii="Arial" w:hAnsi="Arial" w:cs="Arial"/>
+          <w:sz w:val="20"/>
+          <w:szCs w:val="20"/>
+          <w:lang w:val="es-CL"/>
+        </w:rPr>
+        <w:t>admin</w:t>
+      </w:r>
+      <w:proofErr w:type="spellEnd"/>
+      <w:r>
+        <w:rPr>
+          <w:rFonts w:ascii="Arial" w:hAnsi="Arial" w:cs="Arial"/>
+          <w:sz w:val="20"/>
+          <w:szCs w:val="20"/>
+          <w:lang w:val="es-CL"/>
+        </w:rPr>
+        <w:t xml:space="preserve"> (cambios de catálogo, cierres de reporte).</w:t>
       </w:r>
     </w:p>
     <w:p>
@@ -10525,7 +11502,31 @@
           <w:szCs w:val="20"/>
           <w:lang w:val="es-CL"/>
         </w:rPr>
-        <w:t>Modificabilidad y reuso (fácil de mantener)</w:t>
+        <w:t xml:space="preserve">Modificabilidad y </w:t>
+      </w:r>
+      <w:proofErr w:type="spellStart"/>
+      <w:r>
+        <w:rPr>
+          <w:rFonts w:ascii="Arial" w:hAnsi="Arial" w:cs="Arial"/>
+          <w:b/>
+          <w:bCs/>
+          <w:sz w:val="20"/>
+          <w:szCs w:val="20"/>
+          <w:lang w:val="es-CL"/>
+        </w:rPr>
+        <w:t>reuso</w:t>
+      </w:r>
+      <w:proofErr w:type="spellEnd"/>
+      <w:r>
+        <w:rPr>
+          <w:rFonts w:ascii="Arial" w:hAnsi="Arial" w:cs="Arial"/>
+          <w:b/>
+          <w:bCs/>
+          <w:sz w:val="20"/>
+          <w:szCs w:val="20"/>
+          <w:lang w:val="es-CL"/>
+        </w:rPr>
+        <w:t xml:space="preserve"> (fácil de mantener)</w:t>
       </w:r>
     </w:p>
     <w:p>
@@ -10566,7 +11567,27 @@
           <w:szCs w:val="20"/>
           <w:lang w:val="es-CL"/>
         </w:rPr>
-        <w:t>Módulos separados: Catálogo, Reglas de compatibilidad, Recomendador, Moderación/Reportes, Métricas.</w:t>
+        <w:t xml:space="preserve">Módulos separados: Catálogo, Reglas de compatibilidad, </w:t>
+      </w:r>
+      <w:proofErr w:type="spellStart"/>
+      <w:r>
+        <w:rPr>
+          <w:rFonts w:ascii="Arial" w:hAnsi="Arial" w:cs="Arial"/>
+          <w:sz w:val="20"/>
+          <w:szCs w:val="20"/>
+          <w:lang w:val="es-CL"/>
+        </w:rPr>
+        <w:t>Recomendador</w:t>
+      </w:r>
+      <w:proofErr w:type="spellEnd"/>
+      <w:r>
+        <w:rPr>
+          <w:rFonts w:ascii="Arial" w:hAnsi="Arial" w:cs="Arial"/>
+          <w:sz w:val="20"/>
+          <w:szCs w:val="20"/>
+          <w:lang w:val="es-CL"/>
+        </w:rPr>
+        <w:t>, Moderación/Reportes, Métricas.</w:t>
       </w:r>
     </w:p>
     <w:p>
@@ -10622,7 +11643,47 @@
           <w:szCs w:val="20"/>
           <w:lang w:val="es-CL"/>
         </w:rPr>
-        <w:t>Plantillas/componentes reusables (cards, comparativas, badges).</w:t>
+        <w:t>Plantillas/componentes reusables (</w:t>
+      </w:r>
+      <w:proofErr w:type="spellStart"/>
+      <w:r>
+        <w:rPr>
+          <w:rFonts w:ascii="Arial" w:hAnsi="Arial" w:cs="Arial"/>
+          <w:sz w:val="20"/>
+          <w:szCs w:val="20"/>
+          <w:lang w:val="es-CL"/>
+        </w:rPr>
+        <w:t>cards</w:t>
+      </w:r>
+      <w:proofErr w:type="spellEnd"/>
+      <w:r>
+        <w:rPr>
+          <w:rFonts w:ascii="Arial" w:hAnsi="Arial" w:cs="Arial"/>
+          <w:sz w:val="20"/>
+          <w:szCs w:val="20"/>
+          <w:lang w:val="es-CL"/>
+        </w:rPr>
+        <w:t xml:space="preserve">, comparativas, </w:t>
+      </w:r>
+      <w:proofErr w:type="spellStart"/>
+      <w:r>
+        <w:rPr>
+          <w:rFonts w:ascii="Arial" w:hAnsi="Arial" w:cs="Arial"/>
+          <w:sz w:val="20"/>
+          <w:szCs w:val="20"/>
+          <w:lang w:val="es-CL"/>
+        </w:rPr>
+        <w:t>badges</w:t>
+      </w:r>
+      <w:proofErr w:type="spellEnd"/>
+      <w:r>
+        <w:rPr>
+          <w:rFonts w:ascii="Arial" w:hAnsi="Arial" w:cs="Arial"/>
+          <w:sz w:val="20"/>
+          <w:szCs w:val="20"/>
+          <w:lang w:val="es-CL"/>
+        </w:rPr>
+        <w:t>).</w:t>
       </w:r>
     </w:p>
     <w:p>
@@ -10719,14 +11780,25 @@
           <w:lang w:val="es-CL"/>
         </w:rPr>
       </w:pPr>
-      <w:r>
-        <w:rPr>
-          <w:rFonts w:ascii="Arial" w:hAnsi="Arial" w:cs="Arial"/>
-          <w:sz w:val="20"/>
-          <w:szCs w:val="20"/>
-          <w:lang w:val="es-CL"/>
-        </w:rPr>
-        <w:t xml:space="preserve">Explicabilidad: cada recomendación muestra </w:t>
+      <w:proofErr w:type="spellStart"/>
+      <w:r>
+        <w:rPr>
+          <w:rFonts w:ascii="Arial" w:hAnsi="Arial" w:cs="Arial"/>
+          <w:sz w:val="20"/>
+          <w:szCs w:val="20"/>
+          <w:lang w:val="es-CL"/>
+        </w:rPr>
+        <w:t>Explicabilidad</w:t>
+      </w:r>
+      <w:proofErr w:type="spellEnd"/>
+      <w:r>
+        <w:rPr>
+          <w:rFonts w:ascii="Arial" w:hAnsi="Arial" w:cs="Arial"/>
+          <w:sz w:val="20"/>
+          <w:szCs w:val="20"/>
+          <w:lang w:val="es-CL"/>
+        </w:rPr>
+        <w:t xml:space="preserve">: cada recomendación muestra </w:t>
       </w:r>
       <w:r>
         <w:rPr>
@@ -10906,7 +11978,27 @@
           <w:szCs w:val="20"/>
           <w:lang w:val="es-CL"/>
         </w:rPr>
-        <w:t>Compatibilidad confirmada ≥ 95% en builds sugeridas.</w:t>
+        <w:t xml:space="preserve">Compatibilidad confirmada ≥ 95% en </w:t>
+      </w:r>
+      <w:proofErr w:type="spellStart"/>
+      <w:r>
+        <w:rPr>
+          <w:rFonts w:ascii="Arial" w:hAnsi="Arial" w:cs="Arial"/>
+          <w:sz w:val="20"/>
+          <w:szCs w:val="20"/>
+          <w:lang w:val="es-CL"/>
+        </w:rPr>
+        <w:t>builds</w:t>
+      </w:r>
+      <w:proofErr w:type="spellEnd"/>
+      <w:r>
+        <w:rPr>
+          <w:rFonts w:ascii="Arial" w:hAnsi="Arial" w:cs="Arial"/>
+          <w:sz w:val="20"/>
+          <w:szCs w:val="20"/>
+          <w:lang w:val="es-CL"/>
+        </w:rPr>
+        <w:t xml:space="preserve"> sugeridas.</w:t>
       </w:r>
     </w:p>
     <w:p>
@@ -11041,7 +12133,89 @@
           <w:szCs w:val="20"/>
           <w:lang w:val="es-CL"/>
         </w:rPr>
-        <w:t>Registrar automáticamente cada vista/click/favorito en ProductoVisto, ReferenceVisit y UserViewStat.</w:t>
+        <w:t>Registrar automáticamente cada vista/</w:t>
+      </w:r>
+      <w:proofErr w:type="spellStart"/>
+      <w:proofErr w:type="gramStart"/>
+      <w:r>
+        <w:rPr>
+          <w:rFonts w:ascii="Arial" w:hAnsi="Arial" w:cs="Arial"/>
+          <w:sz w:val="20"/>
+          <w:szCs w:val="20"/>
+          <w:lang w:val="es-CL"/>
+        </w:rPr>
+        <w:t>click</w:t>
+      </w:r>
+      <w:proofErr w:type="spellEnd"/>
+      <w:proofErr w:type="gramEnd"/>
+      <w:r>
+        <w:rPr>
+          <w:rFonts w:ascii="Arial" w:hAnsi="Arial" w:cs="Arial"/>
+          <w:sz w:val="20"/>
+          <w:szCs w:val="20"/>
+          <w:lang w:val="es-CL"/>
+        </w:rPr>
+        <w:t xml:space="preserve">/favorito en </w:t>
+      </w:r>
+      <w:proofErr w:type="spellStart"/>
+      <w:r>
+        <w:rPr>
+          <w:rFonts w:ascii="Arial" w:hAnsi="Arial" w:cs="Arial"/>
+          <w:sz w:val="20"/>
+          <w:szCs w:val="20"/>
+          <w:lang w:val="es-CL"/>
+        </w:rPr>
+        <w:t>ProductoVisto</w:t>
+      </w:r>
+      <w:proofErr w:type="spellEnd"/>
+      <w:r>
+        <w:rPr>
+          <w:rFonts w:ascii="Arial" w:hAnsi="Arial" w:cs="Arial"/>
+          <w:sz w:val="20"/>
+          <w:szCs w:val="20"/>
+          <w:lang w:val="es-CL"/>
+        </w:rPr>
+        <w:t xml:space="preserve">, </w:t>
+      </w:r>
+      <w:proofErr w:type="spellStart"/>
+      <w:r>
+        <w:rPr>
+          <w:rFonts w:ascii="Arial" w:hAnsi="Arial" w:cs="Arial"/>
+          <w:sz w:val="20"/>
+          <w:szCs w:val="20"/>
+          <w:lang w:val="es-CL"/>
+        </w:rPr>
+        <w:t>ReferenceVisit</w:t>
+      </w:r>
+      <w:proofErr w:type="spellEnd"/>
+      <w:r>
+        <w:rPr>
+          <w:rFonts w:ascii="Arial" w:hAnsi="Arial" w:cs="Arial"/>
+          <w:sz w:val="20"/>
+          <w:szCs w:val="20"/>
+          <w:lang w:val="es-CL"/>
+        </w:rPr>
+        <w:t xml:space="preserve"> y </w:t>
+      </w:r>
+      <w:proofErr w:type="spellStart"/>
+      <w:r>
+        <w:rPr>
+          <w:rFonts w:ascii="Arial" w:hAnsi="Arial" w:cs="Arial"/>
+          <w:sz w:val="20"/>
+          <w:szCs w:val="20"/>
+          <w:lang w:val="es-CL"/>
+        </w:rPr>
+        <w:t>UserViewStat</w:t>
+      </w:r>
+      <w:proofErr w:type="spellEnd"/>
+      <w:r>
+        <w:rPr>
+          <w:rFonts w:ascii="Arial" w:hAnsi="Arial" w:cs="Arial"/>
+          <w:sz w:val="20"/>
+          <w:szCs w:val="20"/>
+          <w:lang w:val="es-CL"/>
+        </w:rPr>
+        <w:t>.</w:t>
       </w:r>
     </w:p>
     <w:p>
@@ -11067,7 +12241,27 @@
           <w:szCs w:val="20"/>
           <w:lang w:val="es-CL"/>
         </w:rPr>
-        <w:t>Generar afinidad personal: radar y recomendaciones deben usar esos contadores (marcas, tipos, rangos de precio) para prikorizar contenido relevante.</w:t>
+        <w:t xml:space="preserve">Generar afinidad personal: radar y recomendaciones deben usar esos contadores (marcas, tipos, rangos de precio) para </w:t>
+      </w:r>
+      <w:proofErr w:type="spellStart"/>
+      <w:r>
+        <w:rPr>
+          <w:rFonts w:ascii="Arial" w:hAnsi="Arial" w:cs="Arial"/>
+          <w:sz w:val="20"/>
+          <w:szCs w:val="20"/>
+          <w:lang w:val="es-CL"/>
+        </w:rPr>
+        <w:t>prikorizar</w:t>
+      </w:r>
+      <w:proofErr w:type="spellEnd"/>
+      <w:r>
+        <w:rPr>
+          <w:rFonts w:ascii="Arial" w:hAnsi="Arial" w:cs="Arial"/>
+          <w:sz w:val="20"/>
+          <w:szCs w:val="20"/>
+          <w:lang w:val="es-CL"/>
+        </w:rPr>
+        <w:t xml:space="preserve"> contenido relevante.</w:t>
       </w:r>
     </w:p>
     <w:p>
@@ -11093,7 +12287,47 @@
           <w:szCs w:val="20"/>
           <w:lang w:val="es-CL"/>
         </w:rPr>
-        <w:t xml:space="preserve">Exponer tendencias en el panel admin (marcas más vistas, tiendas más clickeadas, embudo vistas </w:t>
+        <w:t xml:space="preserve">Exponer tendencias en el panel </w:t>
+      </w:r>
+      <w:proofErr w:type="spellStart"/>
+      <w:r>
+        <w:rPr>
+          <w:rFonts w:ascii="Arial" w:hAnsi="Arial" w:cs="Arial"/>
+          <w:sz w:val="20"/>
+          <w:szCs w:val="20"/>
+          <w:lang w:val="es-CL"/>
+        </w:rPr>
+        <w:t>admin</w:t>
+      </w:r>
+      <w:proofErr w:type="spellEnd"/>
+      <w:r>
+        <w:rPr>
+          <w:rFonts w:ascii="Arial" w:hAnsi="Arial" w:cs="Arial"/>
+          <w:sz w:val="20"/>
+          <w:szCs w:val="20"/>
+          <w:lang w:val="es-CL"/>
+        </w:rPr>
+        <w:t xml:space="preserve"> (marcas más vistas, tiendas más </w:t>
+      </w:r>
+      <w:proofErr w:type="spellStart"/>
+      <w:r>
+        <w:rPr>
+          <w:rFonts w:ascii="Arial" w:hAnsi="Arial" w:cs="Arial"/>
+          <w:sz w:val="20"/>
+          <w:szCs w:val="20"/>
+          <w:lang w:val="es-CL"/>
+        </w:rPr>
+        <w:t>clickeadas</w:t>
+      </w:r>
+      <w:proofErr w:type="spellEnd"/>
+      <w:r>
+        <w:rPr>
+          <w:rFonts w:ascii="Arial" w:hAnsi="Arial" w:cs="Arial"/>
+          <w:sz w:val="20"/>
+          <w:szCs w:val="20"/>
+          <w:lang w:val="es-CL"/>
+        </w:rPr>
+        <w:t xml:space="preserve">, embudo vistas </w:t>
       </w:r>
       <w:r>
         <w:rPr>
@@ -11137,7 +12371,47 @@
           <w:lang w:val="es-CL"/>
         </w:rPr>
         <w:lastRenderedPageBreak/>
-        <w:t>Definir métricas ancla:  ≥80 % de usuarios con al menos un UserViewStat reciente y reportes de analytics actualizados &lt;24 h.</w:t>
+        <w:t xml:space="preserve">Definir métricas ancla:  ≥80 % de usuarios con al menos un </w:t>
+      </w:r>
+      <w:proofErr w:type="spellStart"/>
+      <w:r>
+        <w:rPr>
+          <w:rFonts w:ascii="Arial" w:hAnsi="Arial" w:cs="Arial"/>
+          <w:sz w:val="20"/>
+          <w:szCs w:val="20"/>
+          <w:lang w:val="es-CL"/>
+        </w:rPr>
+        <w:t>UserViewStat</w:t>
+      </w:r>
+      <w:proofErr w:type="spellEnd"/>
+      <w:r>
+        <w:rPr>
+          <w:rFonts w:ascii="Arial" w:hAnsi="Arial" w:cs="Arial"/>
+          <w:sz w:val="20"/>
+          <w:szCs w:val="20"/>
+          <w:lang w:val="es-CL"/>
+        </w:rPr>
+        <w:t xml:space="preserve"> reciente y reportes de </w:t>
+      </w:r>
+      <w:proofErr w:type="spellStart"/>
+      <w:r>
+        <w:rPr>
+          <w:rFonts w:ascii="Arial" w:hAnsi="Arial" w:cs="Arial"/>
+          <w:sz w:val="20"/>
+          <w:szCs w:val="20"/>
+          <w:lang w:val="es-CL"/>
+        </w:rPr>
+        <w:t>analytics</w:t>
+      </w:r>
+      <w:proofErr w:type="spellEnd"/>
+      <w:r>
+        <w:rPr>
+          <w:rFonts w:ascii="Arial" w:hAnsi="Arial" w:cs="Arial"/>
+          <w:sz w:val="20"/>
+          <w:szCs w:val="20"/>
+          <w:lang w:val="es-CL"/>
+        </w:rPr>
+        <w:t xml:space="preserve"> actualizados &lt;24 h.</w:t>
       </w:r>
     </w:p>
     <w:p>
@@ -11288,7 +12562,25 @@
           <w:sz w:val="20"/>
           <w:szCs w:val="20"/>
         </w:rPr>
-        <w:t>: ventana acotada (semestre). Priorización estricta: Recomendador &gt; Compatibilidad &gt; Moderación &gt; Métricas avanzadas.</w:t>
+        <w:t xml:space="preserve">: ventana acotada (semestre). Priorización estricta: </w:t>
+      </w:r>
+      <w:proofErr w:type="spellStart"/>
+      <w:r>
+        <w:rPr>
+          <w:rFonts w:ascii="Arial" w:hAnsi="Arial" w:cs="Arial"/>
+          <w:sz w:val="20"/>
+          <w:szCs w:val="20"/>
+        </w:rPr>
+        <w:t>Recomendador</w:t>
+      </w:r>
+      <w:proofErr w:type="spellEnd"/>
+      <w:r>
+        <w:rPr>
+          <w:rFonts w:ascii="Arial" w:hAnsi="Arial" w:cs="Arial"/>
+          <w:sz w:val="20"/>
+          <w:szCs w:val="20"/>
+        </w:rPr>
+        <w:t xml:space="preserve"> &gt; Compatibilidad &gt; Moderación &gt; Métricas avanzadas.</w:t>
       </w:r>
     </w:p>
     <w:p>
@@ -11313,8 +12605,21 @@
           <w:sz w:val="20"/>
           <w:szCs w:val="20"/>
         </w:rPr>
-        <w:t>Equipo y stack</w:t>
-      </w:r>
+        <w:t xml:space="preserve">Equipo y </w:t>
+      </w:r>
+      <w:proofErr w:type="spellStart"/>
+      <w:r>
+        <w:rPr>
+          <w:rStyle w:val="Textoennegrita"/>
+          <w:rFonts w:ascii="Arial" w:eastAsiaTheme="majorEastAsia" w:hAnsi="Arial" w:cs="Arial"/>
+          <w:b w:val="0"/>
+          <w:bCs w:val="0"/>
+          <w:sz w:val="20"/>
+          <w:szCs w:val="20"/>
+        </w:rPr>
+        <w:t>stack</w:t>
+      </w:r>
+      <w:proofErr w:type="spellEnd"/>
       <w:r>
         <w:rPr>
           <w:rFonts w:ascii="Arial" w:hAnsi="Arial" w:cs="Arial"/>
@@ -11354,7 +12659,43 @@
           <w:sz w:val="20"/>
           <w:szCs w:val="20"/>
         </w:rPr>
-        <w:t>: 1 app + 1 DB + caché (opcional). Despliegue simple (contendor/VM). Backups programados.</w:t>
+        <w:t xml:space="preserve">: 1 </w:t>
+      </w:r>
+      <w:proofErr w:type="gramStart"/>
+      <w:r>
+        <w:rPr>
+          <w:rFonts w:ascii="Arial" w:hAnsi="Arial" w:cs="Arial"/>
+          <w:sz w:val="20"/>
+          <w:szCs w:val="20"/>
+        </w:rPr>
+        <w:t>app</w:t>
+      </w:r>
+      <w:proofErr w:type="gramEnd"/>
+      <w:r>
+        <w:rPr>
+          <w:rFonts w:ascii="Arial" w:hAnsi="Arial" w:cs="Arial"/>
+          <w:sz w:val="20"/>
+          <w:szCs w:val="20"/>
+        </w:rPr>
+        <w:t xml:space="preserve"> + 1 DB + caché (opcional). Despliegue simple (contendor/VM). </w:t>
+      </w:r>
+      <w:proofErr w:type="spellStart"/>
+      <w:r>
+        <w:rPr>
+          <w:rFonts w:ascii="Arial" w:hAnsi="Arial" w:cs="Arial"/>
+          <w:sz w:val="20"/>
+          <w:szCs w:val="20"/>
+        </w:rPr>
+        <w:t>Backups</w:t>
+      </w:r>
+      <w:proofErr w:type="spellEnd"/>
+      <w:r>
+        <w:rPr>
+          <w:rFonts w:ascii="Arial" w:hAnsi="Arial" w:cs="Arial"/>
+          <w:sz w:val="20"/>
+          <w:szCs w:val="20"/>
+        </w:rPr>
+        <w:t xml:space="preserve"> programados.</w:t>
       </w:r>
     </w:p>
     <w:p>
@@ -11387,7 +12728,25 @@
           <w:sz w:val="20"/>
           <w:szCs w:val="20"/>
         </w:rPr>
-        <w:t>: evitar licencias de pago; preferir componentes open-source.</w:t>
+        <w:t>: evitar licencias de pago; preferir componentes open-</w:t>
+      </w:r>
+      <w:proofErr w:type="spellStart"/>
+      <w:r>
+        <w:rPr>
+          <w:rFonts w:ascii="Arial" w:hAnsi="Arial" w:cs="Arial"/>
+          <w:sz w:val="20"/>
+          <w:szCs w:val="20"/>
+        </w:rPr>
+        <w:t>source</w:t>
+      </w:r>
+      <w:proofErr w:type="spellEnd"/>
+      <w:r>
+        <w:rPr>
+          <w:rFonts w:ascii="Arial" w:hAnsi="Arial" w:cs="Arial"/>
+          <w:sz w:val="20"/>
+          <w:szCs w:val="20"/>
+        </w:rPr>
+        <w:t>.</w:t>
       </w:r>
     </w:p>
     <w:p>
@@ -11420,7 +12779,25 @@
           <w:sz w:val="20"/>
           <w:szCs w:val="20"/>
         </w:rPr>
-        <w:t>: Web responsive; móvil a futuro (PWA o app). Debe verse bien en escritorio y smartphone.</w:t>
+        <w:t xml:space="preserve">: Web responsive; móvil a futuro (PWA o </w:t>
+      </w:r>
+      <w:proofErr w:type="gramStart"/>
+      <w:r>
+        <w:rPr>
+          <w:rFonts w:ascii="Arial" w:hAnsi="Arial" w:cs="Arial"/>
+          <w:sz w:val="20"/>
+          <w:szCs w:val="20"/>
+        </w:rPr>
+        <w:t>app</w:t>
+      </w:r>
+      <w:proofErr w:type="gramEnd"/>
+      <w:r>
+        <w:rPr>
+          <w:rFonts w:ascii="Arial" w:hAnsi="Arial" w:cs="Arial"/>
+          <w:sz w:val="20"/>
+          <w:szCs w:val="20"/>
+        </w:rPr>
+        <w:t>). Debe verse bien en escritorio y smartphone.</w:t>
       </w:r>
     </w:p>
     <w:p>
@@ -11472,7 +12849,43 @@
           <w:sz w:val="20"/>
           <w:szCs w:val="20"/>
         </w:rPr>
-        <w:t xml:space="preserve"> o falta de specs; la app debe tolerarlo.</w:t>
+        <w:t xml:space="preserve"> o falta de </w:t>
+      </w:r>
+      <w:proofErr w:type="spellStart"/>
+      <w:r>
+        <w:rPr>
+          <w:rFonts w:ascii="Arial" w:hAnsi="Arial" w:cs="Arial"/>
+          <w:sz w:val="20"/>
+          <w:szCs w:val="20"/>
+        </w:rPr>
+        <w:t>specs</w:t>
+      </w:r>
+      <w:proofErr w:type="spellEnd"/>
+      <w:r>
+        <w:rPr>
+          <w:rFonts w:ascii="Arial" w:hAnsi="Arial" w:cs="Arial"/>
+          <w:sz w:val="20"/>
+          <w:szCs w:val="20"/>
+        </w:rPr>
+        <w:t xml:space="preserve">; la </w:t>
+      </w:r>
+      <w:proofErr w:type="gramStart"/>
+      <w:r>
+        <w:rPr>
+          <w:rFonts w:ascii="Arial" w:hAnsi="Arial" w:cs="Arial"/>
+          <w:sz w:val="20"/>
+          <w:szCs w:val="20"/>
+        </w:rPr>
+        <w:t>app</w:t>
+      </w:r>
+      <w:proofErr w:type="gramEnd"/>
+      <w:r>
+        <w:rPr>
+          <w:rFonts w:ascii="Arial" w:hAnsi="Arial" w:cs="Arial"/>
+          <w:sz w:val="20"/>
+          <w:szCs w:val="20"/>
+        </w:rPr>
+        <w:t xml:space="preserve"> debe tolerarlo.</w:t>
       </w:r>
     </w:p>
     <w:p>
@@ -11505,7 +12918,25 @@
           <w:sz w:val="20"/>
           <w:szCs w:val="20"/>
         </w:rPr>
-        <w:t>: latencias variables; UI no debe bloquear (spinners, estados vacíos).</w:t>
+        <w:t>: latencias variables; UI no debe bloquear (</w:t>
+      </w:r>
+      <w:proofErr w:type="spellStart"/>
+      <w:r>
+        <w:rPr>
+          <w:rFonts w:ascii="Arial" w:hAnsi="Arial" w:cs="Arial"/>
+          <w:sz w:val="20"/>
+          <w:szCs w:val="20"/>
+        </w:rPr>
+        <w:t>spinners</w:t>
+      </w:r>
+      <w:proofErr w:type="spellEnd"/>
+      <w:r>
+        <w:rPr>
+          <w:rFonts w:ascii="Arial" w:hAnsi="Arial" w:cs="Arial"/>
+          <w:sz w:val="20"/>
+          <w:szCs w:val="20"/>
+        </w:rPr>
+        <w:t>, estados vacíos).</w:t>
       </w:r>
     </w:p>
     <w:p>
@@ -11571,7 +13002,25 @@
           <w:sz w:val="20"/>
           <w:szCs w:val="20"/>
         </w:rPr>
-        <w:t>: páginas informativas accesibles, pero sin exposición de endpoints internos.</w:t>
+        <w:t xml:space="preserve">: páginas informativas accesibles, pero sin exposición de </w:t>
+      </w:r>
+      <w:proofErr w:type="spellStart"/>
+      <w:r>
+        <w:rPr>
+          <w:rFonts w:ascii="Arial" w:hAnsi="Arial" w:cs="Arial"/>
+          <w:sz w:val="20"/>
+          <w:szCs w:val="20"/>
+        </w:rPr>
+        <w:t>endpoints</w:t>
+      </w:r>
+      <w:proofErr w:type="spellEnd"/>
+      <w:r>
+        <w:rPr>
+          <w:rFonts w:ascii="Arial" w:hAnsi="Arial" w:cs="Arial"/>
+          <w:sz w:val="20"/>
+          <w:szCs w:val="20"/>
+        </w:rPr>
+        <w:t xml:space="preserve"> internos.</w:t>
       </w:r>
     </w:p>
     <w:p>
@@ -11629,7 +13078,67 @@
           <w:szCs w:val="20"/>
           <w:lang w:val="es-CL" w:eastAsia="es-CL"/>
         </w:rPr>
-        <w:t>Analítica: se implementa con tablas internas (ProductoVisto, ReferenceVisit, UserViewStat). Sin pipelines externos ni servicios de ML en esta fase.</w:t>
+        <w:t>Analítica: se implementa con tablas internas (</w:t>
+      </w:r>
+      <w:proofErr w:type="spellStart"/>
+      <w:r>
+        <w:rPr>
+          <w:rFonts w:ascii="Arial" w:eastAsia="Times New Roman" w:hAnsi="Arial" w:cs="Arial"/>
+          <w:sz w:val="20"/>
+          <w:szCs w:val="20"/>
+          <w:lang w:val="es-CL" w:eastAsia="es-CL"/>
+        </w:rPr>
+        <w:t>ProductoVisto</w:t>
+      </w:r>
+      <w:proofErr w:type="spellEnd"/>
+      <w:r>
+        <w:rPr>
+          <w:rFonts w:ascii="Arial" w:eastAsia="Times New Roman" w:hAnsi="Arial" w:cs="Arial"/>
+          <w:sz w:val="20"/>
+          <w:szCs w:val="20"/>
+          <w:lang w:val="es-CL" w:eastAsia="es-CL"/>
+        </w:rPr>
+        <w:t xml:space="preserve">, </w:t>
+      </w:r>
+      <w:proofErr w:type="spellStart"/>
+      <w:r>
+        <w:rPr>
+          <w:rFonts w:ascii="Arial" w:eastAsia="Times New Roman" w:hAnsi="Arial" w:cs="Arial"/>
+          <w:sz w:val="20"/>
+          <w:szCs w:val="20"/>
+          <w:lang w:val="es-CL" w:eastAsia="es-CL"/>
+        </w:rPr>
+        <w:t>ReferenceVisit</w:t>
+      </w:r>
+      <w:proofErr w:type="spellEnd"/>
+      <w:r>
+        <w:rPr>
+          <w:rFonts w:ascii="Arial" w:eastAsia="Times New Roman" w:hAnsi="Arial" w:cs="Arial"/>
+          <w:sz w:val="20"/>
+          <w:szCs w:val="20"/>
+          <w:lang w:val="es-CL" w:eastAsia="es-CL"/>
+        </w:rPr>
+        <w:t xml:space="preserve">, </w:t>
+      </w:r>
+      <w:proofErr w:type="spellStart"/>
+      <w:r>
+        <w:rPr>
+          <w:rFonts w:ascii="Arial" w:eastAsia="Times New Roman" w:hAnsi="Arial" w:cs="Arial"/>
+          <w:sz w:val="20"/>
+          <w:szCs w:val="20"/>
+          <w:lang w:val="es-CL" w:eastAsia="es-CL"/>
+        </w:rPr>
+        <w:t>UserViewStat</w:t>
+      </w:r>
+      <w:proofErr w:type="spellEnd"/>
+      <w:r>
+        <w:rPr>
+          <w:rFonts w:ascii="Arial" w:eastAsia="Times New Roman" w:hAnsi="Arial" w:cs="Arial"/>
+          <w:sz w:val="20"/>
+          <w:szCs w:val="20"/>
+          <w:lang w:val="es-CL" w:eastAsia="es-CL"/>
+        </w:rPr>
+        <w:t>). Sin pipelines externos ni servicios de ML en esta fase.</w:t>
       </w:r>
     </w:p>
     <w:p>
@@ -11774,7 +13283,27 @@
           <w:szCs w:val="20"/>
           <w:lang w:val="es-CL"/>
         </w:rPr>
-        <w:t>Experiencia: el equipo ya maneja Django, modelos, panel admin y vistas; acelera la entrega.</w:t>
+        <w:t xml:space="preserve">Experiencia: el equipo ya maneja Django, modelos, panel </w:t>
+      </w:r>
+      <w:proofErr w:type="spellStart"/>
+      <w:r>
+        <w:rPr>
+          <w:rFonts w:ascii="Arial" w:hAnsi="Arial" w:cs="Arial"/>
+          <w:sz w:val="20"/>
+          <w:szCs w:val="20"/>
+          <w:lang w:val="es-CL"/>
+        </w:rPr>
+        <w:t>admin</w:t>
+      </w:r>
+      <w:proofErr w:type="spellEnd"/>
+      <w:r>
+        <w:rPr>
+          <w:rFonts w:ascii="Arial" w:hAnsi="Arial" w:cs="Arial"/>
+          <w:sz w:val="20"/>
+          <w:szCs w:val="20"/>
+          <w:lang w:val="es-CL"/>
+        </w:rPr>
+        <w:t xml:space="preserve"> y vistas; acelera la entrega.</w:t>
       </w:r>
     </w:p>
     <w:p>
@@ -11801,6 +13330,7 @@
         </w:rPr>
         <w:t>Habilidades: conocimiento de compatibilidad de hardware (CPU/MB/RAM/GPU/PSU) y mapeo a perfiles (</w:t>
       </w:r>
+      <w:proofErr w:type="spellStart"/>
       <w:r>
         <w:rPr>
           <w:rFonts w:ascii="Arial" w:hAnsi="Arial" w:cs="Arial"/>
@@ -11810,7 +13340,19 @@
           <w:szCs w:val="20"/>
           <w:lang w:val="es-CL"/>
         </w:rPr>
-        <w:t>gamer, hogar, estudio, trabajo/diseño</w:t>
+        <w:t>gamer</w:t>
+      </w:r>
+      <w:proofErr w:type="spellEnd"/>
+      <w:r>
+        <w:rPr>
+          <w:rFonts w:ascii="Arial" w:hAnsi="Arial" w:cs="Arial"/>
+          <w:i/>
+          <w:iCs/>
+          <w:sz w:val="20"/>
+          <w:szCs w:val="20"/>
+          <w:lang w:val="es-CL"/>
+        </w:rPr>
+        <w:t>, hogar, estudio, trabajo/diseño</w:t>
       </w:r>
       <w:r>
         <w:rPr>
@@ -12072,7 +13614,47 @@
           <w:szCs w:val="20"/>
           <w:lang w:val="es-CL"/>
         </w:rPr>
-        <w:t>Latencia alta en horas punta: precalcular listas base por categoría+perfil, cachear y paginar.</w:t>
+        <w:t xml:space="preserve">Latencia alta en horas punta: </w:t>
+      </w:r>
+      <w:proofErr w:type="spellStart"/>
+      <w:r>
+        <w:rPr>
+          <w:rFonts w:ascii="Arial" w:hAnsi="Arial" w:cs="Arial"/>
+          <w:sz w:val="20"/>
+          <w:szCs w:val="20"/>
+          <w:lang w:val="es-CL"/>
+        </w:rPr>
+        <w:t>precalcular</w:t>
+      </w:r>
+      <w:proofErr w:type="spellEnd"/>
+      <w:r>
+        <w:rPr>
+          <w:rFonts w:ascii="Arial" w:hAnsi="Arial" w:cs="Arial"/>
+          <w:sz w:val="20"/>
+          <w:szCs w:val="20"/>
+          <w:lang w:val="es-CL"/>
+        </w:rPr>
+        <w:t xml:space="preserve"> listas base por </w:t>
+      </w:r>
+      <w:proofErr w:type="spellStart"/>
+      <w:r>
+        <w:rPr>
+          <w:rFonts w:ascii="Arial" w:hAnsi="Arial" w:cs="Arial"/>
+          <w:sz w:val="20"/>
+          <w:szCs w:val="20"/>
+          <w:lang w:val="es-CL"/>
+        </w:rPr>
+        <w:t>categoría+perfil</w:t>
+      </w:r>
+      <w:proofErr w:type="spellEnd"/>
+      <w:r>
+        <w:rPr>
+          <w:rFonts w:ascii="Arial" w:hAnsi="Arial" w:cs="Arial"/>
+          <w:sz w:val="20"/>
+          <w:szCs w:val="20"/>
+          <w:lang w:val="es-CL"/>
+        </w:rPr>
+        <w:t>, cachear y paginar.</w:t>
       </w:r>
     </w:p>
     <w:p>
@@ -12102,7 +13684,47 @@
           <w:szCs w:val="20"/>
           <w:lang w:val="es-CL"/>
         </w:rPr>
-        <w:t>Abuso de reportes: rate limit + captcha ligero para anónimos si hiciera falta.</w:t>
+        <w:t xml:space="preserve">Abuso de reportes: </w:t>
+      </w:r>
+      <w:proofErr w:type="spellStart"/>
+      <w:r>
+        <w:rPr>
+          <w:rFonts w:ascii="Arial" w:hAnsi="Arial" w:cs="Arial"/>
+          <w:sz w:val="20"/>
+          <w:szCs w:val="20"/>
+          <w:lang w:val="es-CL"/>
+        </w:rPr>
+        <w:t>rate</w:t>
+      </w:r>
+      <w:proofErr w:type="spellEnd"/>
+      <w:r>
+        <w:rPr>
+          <w:rFonts w:ascii="Arial" w:hAnsi="Arial" w:cs="Arial"/>
+          <w:sz w:val="20"/>
+          <w:szCs w:val="20"/>
+          <w:lang w:val="es-CL"/>
+        </w:rPr>
+        <w:t xml:space="preserve"> </w:t>
+      </w:r>
+      <w:proofErr w:type="spellStart"/>
+      <w:r>
+        <w:rPr>
+          <w:rFonts w:ascii="Arial" w:hAnsi="Arial" w:cs="Arial"/>
+          <w:sz w:val="20"/>
+          <w:szCs w:val="20"/>
+          <w:lang w:val="es-CL"/>
+        </w:rPr>
+        <w:t>limit</w:t>
+      </w:r>
+      <w:proofErr w:type="spellEnd"/>
+      <w:r>
+        <w:rPr>
+          <w:rFonts w:ascii="Arial" w:hAnsi="Arial" w:cs="Arial"/>
+          <w:sz w:val="20"/>
+          <w:szCs w:val="20"/>
+          <w:lang w:val="es-CL"/>
+        </w:rPr>
+        <w:t xml:space="preserve"> + captcha ligero para anónimos si hiciera falta.</w:t>
       </w:r>
     </w:p>
     <w:p>
@@ -12124,7 +13746,47 @@
           <w:szCs w:val="20"/>
           <w:lang w:val="es-CL"/>
         </w:rPr>
-        <w:t>Inconsistencia en métricas/estadísticas: si los contadores (UserViewStat, ReferenceVisit) fallan, las recomendaciones pueden degradarse. Mitigar con pruebas unitarias y alertas cuando las tablas no se actualicen en &gt;24 h.</w:t>
+        <w:t>Inconsistencia en métricas/estadísticas: si los contadores (</w:t>
+      </w:r>
+      <w:proofErr w:type="spellStart"/>
+      <w:r>
+        <w:rPr>
+          <w:rFonts w:ascii="Arial" w:hAnsi="Arial" w:cs="Arial"/>
+          <w:sz w:val="20"/>
+          <w:szCs w:val="20"/>
+          <w:lang w:val="es-CL"/>
+        </w:rPr>
+        <w:t>UserViewStat</w:t>
+      </w:r>
+      <w:proofErr w:type="spellEnd"/>
+      <w:r>
+        <w:rPr>
+          <w:rFonts w:ascii="Arial" w:hAnsi="Arial" w:cs="Arial"/>
+          <w:sz w:val="20"/>
+          <w:szCs w:val="20"/>
+          <w:lang w:val="es-CL"/>
+        </w:rPr>
+        <w:t xml:space="preserve">, </w:t>
+      </w:r>
+      <w:proofErr w:type="spellStart"/>
+      <w:r>
+        <w:rPr>
+          <w:rFonts w:ascii="Arial" w:hAnsi="Arial" w:cs="Arial"/>
+          <w:sz w:val="20"/>
+          <w:szCs w:val="20"/>
+          <w:lang w:val="es-CL"/>
+        </w:rPr>
+        <w:t>ReferenceVisit</w:t>
+      </w:r>
+      <w:proofErr w:type="spellEnd"/>
+      <w:r>
+        <w:rPr>
+          <w:rFonts w:ascii="Arial" w:hAnsi="Arial" w:cs="Arial"/>
+          <w:sz w:val="20"/>
+          <w:szCs w:val="20"/>
+          <w:lang w:val="es-CL"/>
+        </w:rPr>
+        <w:t>) fallan, las recomendaciones pueden degradarse. Mitigar con pruebas unitarias y alertas cuando las tablas no se actualicen en &gt;24 h.</w:t>
       </w:r>
     </w:p>
     <w:p>
@@ -12731,7 +14393,7 @@
           <w:szCs w:val="20"/>
         </w:rPr>
         <w:drawing>
-          <wp:inline distT="0" distB="0" distL="0" distR="0" wp14:anchorId="741C93FA" wp14:editId="63BFCA78">
+          <wp:inline distT="0" distB="0" distL="0" distR="0" wp14:anchorId="741C93FA" wp14:editId="449FC814">
             <wp:extent cx="5612130" cy="4549235"/>
             <wp:effectExtent l="0" t="0" r="7620" b="3810"/>
             <wp:docPr id="1516809755" name="Imagen 16" descr="Diagrama, Esquemático&#10;&#10;El contenido generado por IA puede ser incorrecto."/>
@@ -13012,7 +14674,25 @@
           <w:sz w:val="20"/>
           <w:szCs w:val="20"/>
         </w:rPr>
-        <w:t>Involucran varios nodos de la vista de despliegue (cliente web, servidor app, BD, estáticos).</w:t>
+        <w:t xml:space="preserve">Involucran varios nodos de la vista de despliegue (cliente web, servidor </w:t>
+      </w:r>
+      <w:proofErr w:type="gramStart"/>
+      <w:r>
+        <w:rPr>
+          <w:rFonts w:ascii="Arial" w:hAnsi="Arial" w:cs="Arial"/>
+          <w:sz w:val="20"/>
+          <w:szCs w:val="20"/>
+        </w:rPr>
+        <w:t>app</w:t>
+      </w:r>
+      <w:proofErr w:type="gramEnd"/>
+      <w:r>
+        <w:rPr>
+          <w:rFonts w:ascii="Arial" w:hAnsi="Arial" w:cs="Arial"/>
+          <w:sz w:val="20"/>
+          <w:szCs w:val="20"/>
+        </w:rPr>
+        <w:t>, BD, estáticos).</w:t>
       </w:r>
     </w:p>
     <w:p>
@@ -13582,7 +15262,25 @@
                 <w:sz w:val="20"/>
                 <w:szCs w:val="20"/>
               </w:rPr>
-              <w:t>Autenticarse (login)</w:t>
+              <w:t>Autenticarse (</w:t>
+            </w:r>
+            <w:proofErr w:type="spellStart"/>
+            <w:r>
+              <w:rPr>
+                <w:rFonts w:ascii="Arial" w:hAnsi="Arial" w:cs="Arial"/>
+                <w:sz w:val="20"/>
+                <w:szCs w:val="20"/>
+              </w:rPr>
+              <w:t>login</w:t>
+            </w:r>
+            <w:proofErr w:type="spellEnd"/>
+            <w:r>
+              <w:rPr>
+                <w:rFonts w:ascii="Arial" w:hAnsi="Arial" w:cs="Arial"/>
+                <w:sz w:val="20"/>
+                <w:szCs w:val="20"/>
+              </w:rPr>
+              <w:t>)</w:t>
             </w:r>
           </w:p>
         </w:tc>
@@ -14351,7 +16049,27 @@
                 <w:sz w:val="20"/>
                 <w:szCs w:val="20"/>
               </w:rPr>
-              <w:t>Gestionar catálogo (crear/editar producto, referencias, specs)</w:t>
+              <w:t xml:space="preserve">Gestionar catálogo (crear/editar producto, referencias, </w:t>
+            </w:r>
+            <w:proofErr w:type="spellStart"/>
+            <w:r>
+              <w:rPr>
+                <w:rFonts w:ascii="Arial" w:hAnsi="Arial" w:cs="Arial"/>
+                <w:color w:val="212121"/>
+                <w:sz w:val="20"/>
+                <w:szCs w:val="20"/>
+              </w:rPr>
+              <w:t>specs</w:t>
+            </w:r>
+            <w:proofErr w:type="spellEnd"/>
+            <w:r>
+              <w:rPr>
+                <w:rFonts w:ascii="Arial" w:hAnsi="Arial" w:cs="Arial"/>
+                <w:color w:val="212121"/>
+                <w:sz w:val="20"/>
+                <w:szCs w:val="20"/>
+              </w:rPr>
+              <w:t>)</w:t>
             </w:r>
           </w:p>
         </w:tc>
@@ -14696,7 +16414,25 @@
           <w:sz w:val="20"/>
           <w:szCs w:val="20"/>
         </w:rPr>
-        <w:t>Después de un análisis en conjunto con los stakeholders, los escenarios de calidad se expresan a</w:t>
+        <w:t xml:space="preserve">Después de un análisis en conjunto con los </w:t>
+      </w:r>
+      <w:proofErr w:type="spellStart"/>
+      <w:r>
+        <w:rPr>
+          <w:rFonts w:ascii="Arial" w:hAnsi="Arial" w:cs="Arial"/>
+          <w:sz w:val="20"/>
+          <w:szCs w:val="20"/>
+        </w:rPr>
+        <w:t>stakeholders</w:t>
+      </w:r>
+      <w:proofErr w:type="spellEnd"/>
+      <w:r>
+        <w:rPr>
+          <w:rFonts w:ascii="Arial" w:hAnsi="Arial" w:cs="Arial"/>
+          <w:sz w:val="20"/>
+          <w:szCs w:val="20"/>
+        </w:rPr>
+        <w:t>, los escenarios de calidad se expresan a</w:t>
       </w:r>
       <w:r>
         <w:rPr>
@@ -14825,7 +16561,25 @@
           <w:sz w:val="20"/>
           <w:szCs w:val="20"/>
         </w:rPr>
-        <w:t>Cambio en el entorno: Solicitud de recomendación(perfil+filtros).</w:t>
+        <w:t>Cambio en el entorno: Solicitud de recomendación(</w:t>
+      </w:r>
+      <w:proofErr w:type="spellStart"/>
+      <w:r>
+        <w:rPr>
+          <w:rFonts w:ascii="Arial" w:hAnsi="Arial" w:cs="Arial"/>
+          <w:sz w:val="20"/>
+          <w:szCs w:val="20"/>
+        </w:rPr>
+        <w:t>perfil+filtros</w:t>
+      </w:r>
+      <w:proofErr w:type="spellEnd"/>
+      <w:r>
+        <w:rPr>
+          <w:rFonts w:ascii="Arial" w:hAnsi="Arial" w:cs="Arial"/>
+          <w:sz w:val="20"/>
+          <w:szCs w:val="20"/>
+        </w:rPr>
+        <w:t>).</w:t>
       </w:r>
     </w:p>
     <w:p>
@@ -14954,7 +16708,25 @@
           <w:sz w:val="20"/>
           <w:szCs w:val="20"/>
         </w:rPr>
-        <w:t>Nombre: Tolerancia a fallos: Fallback de recomendación.</w:t>
+        <w:t xml:space="preserve">Nombre: Tolerancia a fallos: </w:t>
+      </w:r>
+      <w:proofErr w:type="spellStart"/>
+      <w:r>
+        <w:rPr>
+          <w:rFonts w:ascii="Arial" w:hAnsi="Arial" w:cs="Arial"/>
+          <w:sz w:val="20"/>
+          <w:szCs w:val="20"/>
+        </w:rPr>
+        <w:t>Fallback</w:t>
+      </w:r>
+      <w:proofErr w:type="spellEnd"/>
+      <w:r>
+        <w:rPr>
+          <w:rFonts w:ascii="Arial" w:hAnsi="Arial" w:cs="Arial"/>
+          <w:sz w:val="20"/>
+          <w:szCs w:val="20"/>
+        </w:rPr>
+        <w:t xml:space="preserve"> de recomendación.</w:t>
       </w:r>
     </w:p>
     <w:p>
@@ -15011,7 +16783,25 @@
           <w:sz w:val="20"/>
           <w:szCs w:val="20"/>
         </w:rPr>
-        <w:t>Cambio en el entorno: Timeout o fallo interno del motor.</w:t>
+        <w:t xml:space="preserve">Cambio en el entorno: </w:t>
+      </w:r>
+      <w:proofErr w:type="spellStart"/>
+      <w:r>
+        <w:rPr>
+          <w:rFonts w:ascii="Arial" w:hAnsi="Arial" w:cs="Arial"/>
+          <w:sz w:val="20"/>
+          <w:szCs w:val="20"/>
+        </w:rPr>
+        <w:t>Timeout</w:t>
+      </w:r>
+      <w:proofErr w:type="spellEnd"/>
+      <w:r>
+        <w:rPr>
+          <w:rFonts w:ascii="Arial" w:hAnsi="Arial" w:cs="Arial"/>
+          <w:sz w:val="20"/>
+          <w:szCs w:val="20"/>
+        </w:rPr>
+        <w:t xml:space="preserve"> o fallo interno del motor.</w:t>
       </w:r>
     </w:p>
     <w:p>
@@ -15049,7 +16839,25 @@
           <w:sz w:val="20"/>
           <w:szCs w:val="20"/>
         </w:rPr>
-        <w:t>Medida: Caída controlada en &lt;1 s tras timeout; 0 errores 500 expuestos al usuario.</w:t>
+        <w:t xml:space="preserve">Medida: Caída controlada en &lt;1 s tras </w:t>
+      </w:r>
+      <w:proofErr w:type="spellStart"/>
+      <w:r>
+        <w:rPr>
+          <w:rFonts w:ascii="Arial" w:hAnsi="Arial" w:cs="Arial"/>
+          <w:sz w:val="20"/>
+          <w:szCs w:val="20"/>
+        </w:rPr>
+        <w:t>timeout</w:t>
+      </w:r>
+      <w:proofErr w:type="spellEnd"/>
+      <w:r>
+        <w:rPr>
+          <w:rFonts w:ascii="Arial" w:hAnsi="Arial" w:cs="Arial"/>
+          <w:sz w:val="20"/>
+          <w:szCs w:val="20"/>
+        </w:rPr>
+        <w:t>; 0 errores 500 expuestos al usuario.</w:t>
       </w:r>
     </w:p>
     <w:p>
@@ -15235,7 +17043,25 @@
           <w:sz w:val="20"/>
           <w:szCs w:val="20"/>
         </w:rPr>
-        <w:t>Medida: Uptime ≥ 99.5% mensual; tasa de error 5xx &lt; 0.1% en vistas públicas.</w:t>
+        <w:t xml:space="preserve">Medida: </w:t>
+      </w:r>
+      <w:proofErr w:type="spellStart"/>
+      <w:r>
+        <w:rPr>
+          <w:rFonts w:ascii="Arial" w:hAnsi="Arial" w:cs="Arial"/>
+          <w:sz w:val="20"/>
+          <w:szCs w:val="20"/>
+        </w:rPr>
+        <w:t>Uptime</w:t>
+      </w:r>
+      <w:proofErr w:type="spellEnd"/>
+      <w:r>
+        <w:rPr>
+          <w:rFonts w:ascii="Arial" w:hAnsi="Arial" w:cs="Arial"/>
+          <w:sz w:val="20"/>
+          <w:szCs w:val="20"/>
+        </w:rPr>
+        <w:t xml:space="preserve"> ≥ 99.5% mensual; tasa de error 5xx &lt; 0.1% en vistas públicas.</w:t>
       </w:r>
     </w:p>
     <w:p>
@@ -15382,7 +17208,25 @@
           <w:sz w:val="20"/>
           <w:szCs w:val="20"/>
         </w:rPr>
-        <w:t>Cambio en el entorno: Usuario cambia de tema o navega en mobile.</w:t>
+        <w:t xml:space="preserve">Cambio en el entorno: Usuario cambia de tema o navega en </w:t>
+      </w:r>
+      <w:proofErr w:type="spellStart"/>
+      <w:r>
+        <w:rPr>
+          <w:rFonts w:ascii="Arial" w:hAnsi="Arial" w:cs="Arial"/>
+          <w:sz w:val="20"/>
+          <w:szCs w:val="20"/>
+        </w:rPr>
+        <w:t>mobile</w:t>
+      </w:r>
+      <w:proofErr w:type="spellEnd"/>
+      <w:r>
+        <w:rPr>
+          <w:rFonts w:ascii="Arial" w:hAnsi="Arial" w:cs="Arial"/>
+          <w:sz w:val="20"/>
+          <w:szCs w:val="20"/>
+        </w:rPr>
+        <w:t>.</w:t>
       </w:r>
     </w:p>
     <w:p>
@@ -15420,7 +17264,25 @@
           <w:sz w:val="20"/>
           <w:szCs w:val="20"/>
         </w:rPr>
-        <w:t>Medida: Cumple WCAG AA en contraste; no bloqueos de navegación en mobile.</w:t>
+        <w:t xml:space="preserve">Medida: Cumple WCAG AA en contraste; no bloqueos de navegación en </w:t>
+      </w:r>
+      <w:proofErr w:type="spellStart"/>
+      <w:r>
+        <w:rPr>
+          <w:rFonts w:ascii="Arial" w:hAnsi="Arial" w:cs="Arial"/>
+          <w:sz w:val="20"/>
+          <w:szCs w:val="20"/>
+        </w:rPr>
+        <w:t>mobile</w:t>
+      </w:r>
+      <w:proofErr w:type="spellEnd"/>
+      <w:r>
+        <w:rPr>
+          <w:rFonts w:ascii="Arial" w:hAnsi="Arial" w:cs="Arial"/>
+          <w:sz w:val="20"/>
+          <w:szCs w:val="20"/>
+        </w:rPr>
+        <w:t>.</w:t>
       </w:r>
     </w:p>
     <w:p>
@@ -15570,7 +17432,43 @@
           <w:sz w:val="20"/>
           <w:szCs w:val="20"/>
         </w:rPr>
-        <w:t>Sinopsis: Endpoints sensibles (login, denuncias) resisten abuso básico.</w:t>
+        <w:t xml:space="preserve">Sinopsis: </w:t>
+      </w:r>
+      <w:proofErr w:type="spellStart"/>
+      <w:r>
+        <w:rPr>
+          <w:rFonts w:ascii="Arial" w:hAnsi="Arial" w:cs="Arial"/>
+          <w:sz w:val="20"/>
+          <w:szCs w:val="20"/>
+        </w:rPr>
+        <w:t>Endpoints</w:t>
+      </w:r>
+      <w:proofErr w:type="spellEnd"/>
+      <w:r>
+        <w:rPr>
+          <w:rFonts w:ascii="Arial" w:hAnsi="Arial" w:cs="Arial"/>
+          <w:sz w:val="20"/>
+          <w:szCs w:val="20"/>
+        </w:rPr>
+        <w:t xml:space="preserve"> sensibles (</w:t>
+      </w:r>
+      <w:proofErr w:type="spellStart"/>
+      <w:r>
+        <w:rPr>
+          <w:rFonts w:ascii="Arial" w:hAnsi="Arial" w:cs="Arial"/>
+          <w:sz w:val="20"/>
+          <w:szCs w:val="20"/>
+        </w:rPr>
+        <w:t>login</w:t>
+      </w:r>
+      <w:proofErr w:type="spellEnd"/>
+      <w:r>
+        <w:rPr>
+          <w:rFonts w:ascii="Arial" w:hAnsi="Arial" w:cs="Arial"/>
+          <w:sz w:val="20"/>
+          <w:szCs w:val="20"/>
+        </w:rPr>
+        <w:t>, denuncias) resisten abuso básico.</w:t>
       </w:r>
     </w:p>
     <w:p>
@@ -15608,7 +17506,25 @@
           <w:sz w:val="20"/>
           <w:szCs w:val="20"/>
         </w:rPr>
-        <w:t>Cambio en el entorno: Múltiples intentos de login o envío de denuncias.</w:t>
+        <w:t xml:space="preserve">Cambio en el entorno: Múltiples intentos de </w:t>
+      </w:r>
+      <w:proofErr w:type="spellStart"/>
+      <w:r>
+        <w:rPr>
+          <w:rFonts w:ascii="Arial" w:hAnsi="Arial" w:cs="Arial"/>
+          <w:sz w:val="20"/>
+          <w:szCs w:val="20"/>
+        </w:rPr>
+        <w:t>login</w:t>
+      </w:r>
+      <w:proofErr w:type="spellEnd"/>
+      <w:r>
+        <w:rPr>
+          <w:rFonts w:ascii="Arial" w:hAnsi="Arial" w:cs="Arial"/>
+          <w:sz w:val="20"/>
+          <w:szCs w:val="20"/>
+        </w:rPr>
+        <w:t xml:space="preserve"> o envío de denuncias.</w:t>
       </w:r>
     </w:p>
     <w:p>
@@ -15627,7 +17543,43 @@
           <w:sz w:val="20"/>
           <w:szCs w:val="20"/>
         </w:rPr>
-        <w:t>Comportamiento esperado: Rate limiting básico; sesiones seguras; sin fuga de datos personales.</w:t>
+        <w:t xml:space="preserve">Comportamiento esperado: </w:t>
+      </w:r>
+      <w:proofErr w:type="spellStart"/>
+      <w:r>
+        <w:rPr>
+          <w:rFonts w:ascii="Arial" w:hAnsi="Arial" w:cs="Arial"/>
+          <w:sz w:val="20"/>
+          <w:szCs w:val="20"/>
+        </w:rPr>
+        <w:t>Rate</w:t>
+      </w:r>
+      <w:proofErr w:type="spellEnd"/>
+      <w:r>
+        <w:rPr>
+          <w:rFonts w:ascii="Arial" w:hAnsi="Arial" w:cs="Arial"/>
+          <w:sz w:val="20"/>
+          <w:szCs w:val="20"/>
+        </w:rPr>
+        <w:t xml:space="preserve"> </w:t>
+      </w:r>
+      <w:proofErr w:type="spellStart"/>
+      <w:r>
+        <w:rPr>
+          <w:rFonts w:ascii="Arial" w:hAnsi="Arial" w:cs="Arial"/>
+          <w:sz w:val="20"/>
+          <w:szCs w:val="20"/>
+        </w:rPr>
+        <w:t>limiting</w:t>
+      </w:r>
+      <w:proofErr w:type="spellEnd"/>
+      <w:r>
+        <w:rPr>
+          <w:rFonts w:ascii="Arial" w:hAnsi="Arial" w:cs="Arial"/>
+          <w:sz w:val="20"/>
+          <w:szCs w:val="20"/>
+        </w:rPr>
+        <w:t xml:space="preserve"> básico; sesiones seguras; sin fuga de datos personales.</w:t>
       </w:r>
     </w:p>
     <w:p>
@@ -15646,7 +17598,61 @@
           <w:sz w:val="20"/>
           <w:szCs w:val="20"/>
         </w:rPr>
-        <w:t>Medida: Rate limit activo en endpoints sensibles; 0 credenciales en texto plano; sesiones con expiración y cookies seguras.</w:t>
+        <w:t xml:space="preserve">Medida: </w:t>
+      </w:r>
+      <w:proofErr w:type="spellStart"/>
+      <w:r>
+        <w:rPr>
+          <w:rFonts w:ascii="Arial" w:hAnsi="Arial" w:cs="Arial"/>
+          <w:sz w:val="20"/>
+          <w:szCs w:val="20"/>
+        </w:rPr>
+        <w:t>Rate</w:t>
+      </w:r>
+      <w:proofErr w:type="spellEnd"/>
+      <w:r>
+        <w:rPr>
+          <w:rFonts w:ascii="Arial" w:hAnsi="Arial" w:cs="Arial"/>
+          <w:sz w:val="20"/>
+          <w:szCs w:val="20"/>
+        </w:rPr>
+        <w:t xml:space="preserve"> </w:t>
+      </w:r>
+      <w:proofErr w:type="spellStart"/>
+      <w:r>
+        <w:rPr>
+          <w:rFonts w:ascii="Arial" w:hAnsi="Arial" w:cs="Arial"/>
+          <w:sz w:val="20"/>
+          <w:szCs w:val="20"/>
+        </w:rPr>
+        <w:t>limit</w:t>
+      </w:r>
+      <w:proofErr w:type="spellEnd"/>
+      <w:r>
+        <w:rPr>
+          <w:rFonts w:ascii="Arial" w:hAnsi="Arial" w:cs="Arial"/>
+          <w:sz w:val="20"/>
+          <w:szCs w:val="20"/>
+        </w:rPr>
+        <w:t xml:space="preserve"> activo en </w:t>
+      </w:r>
+      <w:proofErr w:type="spellStart"/>
+      <w:r>
+        <w:rPr>
+          <w:rFonts w:ascii="Arial" w:hAnsi="Arial" w:cs="Arial"/>
+          <w:sz w:val="20"/>
+          <w:szCs w:val="20"/>
+        </w:rPr>
+        <w:t>endpoints</w:t>
+      </w:r>
+      <w:proofErr w:type="spellEnd"/>
+      <w:r>
+        <w:rPr>
+          <w:rFonts w:ascii="Arial" w:hAnsi="Arial" w:cs="Arial"/>
+          <w:sz w:val="20"/>
+          <w:szCs w:val="20"/>
+        </w:rPr>
+        <w:t xml:space="preserve"> sensibles; 0 credenciales en texto plano; sesiones con expiración y cookies seguras.</w:t>
       </w:r>
     </w:p>
     <w:p>
@@ -15684,7 +17690,25 @@
           <w:sz w:val="20"/>
           <w:szCs w:val="20"/>
         </w:rPr>
-        <w:t>Aplicación: Local (endpoints sensibles).</w:t>
+        <w:t>Aplicación: Local (</w:t>
+      </w:r>
+      <w:proofErr w:type="spellStart"/>
+      <w:r>
+        <w:rPr>
+          <w:rFonts w:ascii="Arial" w:hAnsi="Arial" w:cs="Arial"/>
+          <w:sz w:val="20"/>
+          <w:szCs w:val="20"/>
+        </w:rPr>
+        <w:t>endpoints</w:t>
+      </w:r>
+      <w:proofErr w:type="spellEnd"/>
+      <w:r>
+        <w:rPr>
+          <w:rFonts w:ascii="Arial" w:hAnsi="Arial" w:cs="Arial"/>
+          <w:sz w:val="20"/>
+          <w:szCs w:val="20"/>
+        </w:rPr>
+        <w:t xml:space="preserve"> sensibles).</w:t>
       </w:r>
     </w:p>
     <w:p>
@@ -16073,7 +18097,25 @@
           <w:sz w:val="20"/>
           <w:szCs w:val="20"/>
         </w:rPr>
-        <w:t>Refleja la organización del código en paquetes/subpaquetes y qué depende de qué; útil para ubicar responsabilidades en el repo.</w:t>
+        <w:t>Refleja la organización del código en paquetes/</w:t>
+      </w:r>
+      <w:proofErr w:type="spellStart"/>
+      <w:r>
+        <w:rPr>
+          <w:rFonts w:ascii="Arial" w:hAnsi="Arial" w:cs="Arial"/>
+          <w:sz w:val="20"/>
+          <w:szCs w:val="20"/>
+        </w:rPr>
+        <w:t>subpaquetes</w:t>
+      </w:r>
+      <w:proofErr w:type="spellEnd"/>
+      <w:r>
+        <w:rPr>
+          <w:rFonts w:ascii="Arial" w:hAnsi="Arial" w:cs="Arial"/>
+          <w:sz w:val="20"/>
+          <w:szCs w:val="20"/>
+        </w:rPr>
+        <w:t xml:space="preserve"> y qué depende de qué; útil para ubicar responsabilidades en el repo.</w:t>
       </w:r>
     </w:p>
     <w:p>
@@ -16205,7 +18247,25 @@
           <w:sz w:val="20"/>
           <w:szCs w:val="20"/>
         </w:rPr>
-        <w:t>Representa nodos físicos/lógicos (cliente, app, BD, estáticos, cache) y protocolos/puertos; asocia artefactos desplegados a cada nodo.</w:t>
+        <w:t xml:space="preserve">Representa nodos físicos/lógicos (cliente, </w:t>
+      </w:r>
+      <w:proofErr w:type="gramStart"/>
+      <w:r>
+        <w:rPr>
+          <w:rFonts w:ascii="Arial" w:hAnsi="Arial" w:cs="Arial"/>
+          <w:sz w:val="20"/>
+          <w:szCs w:val="20"/>
+        </w:rPr>
+        <w:t>app</w:t>
+      </w:r>
+      <w:proofErr w:type="gramEnd"/>
+      <w:r>
+        <w:rPr>
+          <w:rFonts w:ascii="Arial" w:hAnsi="Arial" w:cs="Arial"/>
+          <w:sz w:val="20"/>
+          <w:szCs w:val="20"/>
+        </w:rPr>
+        <w:t>, BD, estáticos, cache) y protocolos/puertos; asocia artefactos desplegados a cada nodo.</w:t>
       </w:r>
     </w:p>
     <w:p>
@@ -16995,7 +19055,7 @@
           <w:szCs w:val="20"/>
         </w:rPr>
         <w:drawing>
-          <wp:inline distT="0" distB="0" distL="0" distR="0" wp14:anchorId="2BA42B8D" wp14:editId="4DD79D71">
+          <wp:inline distT="0" distB="0" distL="0" distR="0" wp14:anchorId="2BA42B8D" wp14:editId="59FFC7C5">
             <wp:extent cx="5600700" cy="5181600"/>
             <wp:effectExtent l="0" t="0" r="0" b="0"/>
             <wp:docPr id="2047786760" name="Imagen 13"/>
@@ -17278,7 +19338,25 @@
           <w:sz w:val="20"/>
           <w:szCs w:val="20"/>
         </w:rPr>
-        <w:t xml:space="preserve">Optamos por una web adaptable a móvil y escritorio con Django y plantillas para entregar rápido y no duplicar con apps nativas. Mantuvimos una estructura simple en capas (vistas, servicios, modelos) y un despliegue con un servidor de aplicación, una base de datos y los recursos estáticos recolectados; microservicios quedaron fuera por el tamaño del equipo y el alcance. Cuidamos el rendimiento para que la primera recomendación llegue en pocos segundos, con opción de cachear y mostrar una lista “segura” si el motor de recomendación o las reglas de compatibilidad fallan. </w:t>
+        <w:t xml:space="preserve">Optamos por una web adaptable a móvil y escritorio con Django y plantillas para entregar rápido y no duplicar con </w:t>
+      </w:r>
+      <w:proofErr w:type="gramStart"/>
+      <w:r>
+        <w:rPr>
+          <w:rFonts w:ascii="Arial" w:hAnsi="Arial" w:cs="Arial"/>
+          <w:sz w:val="20"/>
+          <w:szCs w:val="20"/>
+        </w:rPr>
+        <w:t>apps</w:t>
+      </w:r>
+      <w:proofErr w:type="gramEnd"/>
+      <w:r>
+        <w:rPr>
+          <w:rFonts w:ascii="Arial" w:hAnsi="Arial" w:cs="Arial"/>
+          <w:sz w:val="20"/>
+          <w:szCs w:val="20"/>
+        </w:rPr>
+        <w:t xml:space="preserve"> nativas. Mantuvimos una estructura simple en capas (vistas, servicios, modelos) y un despliegue con un servidor de aplicación, una base de datos y los recursos estáticos recolectados; microservicios quedaron fuera por el tamaño del equipo y el alcance. Cuidamos el rendimiento para que la primera recomendación llegue en pocos segundos, con opción de cachear y mostrar una lista “segura” si el motor de recomendación o las reglas de compatibilidad fallan. </w:t>
       </w:r>
     </w:p>
     <w:p>
@@ -17341,7 +19419,25 @@
           <w:sz w:val="20"/>
           <w:szCs w:val="20"/>
         </w:rPr>
-        <w:t>En operación, recolectamos estáticos para servirlos mejor, la base de datos solo es accesible desde la app y se programan copias de seguridad.</w:t>
+        <w:t xml:space="preserve">En operación, recolectamos estáticos para servirlos mejor, la base de datos solo es accesible desde la </w:t>
+      </w:r>
+      <w:proofErr w:type="gramStart"/>
+      <w:r>
+        <w:rPr>
+          <w:rFonts w:ascii="Arial" w:hAnsi="Arial" w:cs="Arial"/>
+          <w:sz w:val="20"/>
+          <w:szCs w:val="20"/>
+        </w:rPr>
+        <w:t>app</w:t>
+      </w:r>
+      <w:proofErr w:type="gramEnd"/>
+      <w:r>
+        <w:rPr>
+          <w:rFonts w:ascii="Arial" w:hAnsi="Arial" w:cs="Arial"/>
+          <w:sz w:val="20"/>
+          <w:szCs w:val="20"/>
+        </w:rPr>
+        <w:t xml:space="preserve"> y se programan copias de seguridad.</w:t>
       </w:r>
     </w:p>
     <w:p>
@@ -17638,7 +19734,67 @@
           <w:szCs w:val="20"/>
           <w:lang w:val="es-CL"/>
         </w:rPr>
-        <w:t>Framework y libs: Django, ORM, Bootstrap, iconografía y utilidades JS/CSS open source para acelerar layout y formularios.</w:t>
+        <w:t xml:space="preserve">Framework y </w:t>
+      </w:r>
+      <w:proofErr w:type="spellStart"/>
+      <w:r>
+        <w:rPr>
+          <w:rFonts w:ascii="Arial" w:hAnsi="Arial" w:cs="Arial"/>
+          <w:sz w:val="20"/>
+          <w:szCs w:val="20"/>
+          <w:lang w:val="es-CL"/>
+        </w:rPr>
+        <w:t>libs</w:t>
+      </w:r>
+      <w:proofErr w:type="spellEnd"/>
+      <w:r>
+        <w:rPr>
+          <w:rFonts w:ascii="Arial" w:hAnsi="Arial" w:cs="Arial"/>
+          <w:sz w:val="20"/>
+          <w:szCs w:val="20"/>
+          <w:lang w:val="es-CL"/>
+        </w:rPr>
+        <w:t xml:space="preserve">: Django, ORM, Bootstrap, iconografía y utilidades JS/CSS open </w:t>
+      </w:r>
+      <w:proofErr w:type="spellStart"/>
+      <w:r>
+        <w:rPr>
+          <w:rFonts w:ascii="Arial" w:hAnsi="Arial" w:cs="Arial"/>
+          <w:sz w:val="20"/>
+          <w:szCs w:val="20"/>
+          <w:lang w:val="es-CL"/>
+        </w:rPr>
+        <w:t>source</w:t>
+      </w:r>
+      <w:proofErr w:type="spellEnd"/>
+      <w:r>
+        <w:rPr>
+          <w:rFonts w:ascii="Arial" w:hAnsi="Arial" w:cs="Arial"/>
+          <w:sz w:val="20"/>
+          <w:szCs w:val="20"/>
+          <w:lang w:val="es-CL"/>
+        </w:rPr>
+        <w:t xml:space="preserve"> para acelerar </w:t>
+      </w:r>
+      <w:proofErr w:type="spellStart"/>
+      <w:r>
+        <w:rPr>
+          <w:rFonts w:ascii="Arial" w:hAnsi="Arial" w:cs="Arial"/>
+          <w:sz w:val="20"/>
+          <w:szCs w:val="20"/>
+          <w:lang w:val="es-CL"/>
+        </w:rPr>
+        <w:t>layout</w:t>
+      </w:r>
+      <w:proofErr w:type="spellEnd"/>
+      <w:r>
+        <w:rPr>
+          <w:rFonts w:ascii="Arial" w:hAnsi="Arial" w:cs="Arial"/>
+          <w:sz w:val="20"/>
+          <w:szCs w:val="20"/>
+          <w:lang w:val="es-CL"/>
+        </w:rPr>
+        <w:t xml:space="preserve"> y formularios.</w:t>
       </w:r>
     </w:p>
     <w:p>
@@ -17661,7 +19817,87 @@
           <w:szCs w:val="20"/>
           <w:lang w:val="es-CL"/>
         </w:rPr>
-        <w:t>Componentes UI: cards, listas, filtros, modales y headers/footer reutilizados entre home, resultados, detalle, favoritos y panel admin.</w:t>
+        <w:t xml:space="preserve">Componentes UI: </w:t>
+      </w:r>
+      <w:proofErr w:type="spellStart"/>
+      <w:r>
+        <w:rPr>
+          <w:rFonts w:ascii="Arial" w:hAnsi="Arial" w:cs="Arial"/>
+          <w:sz w:val="20"/>
+          <w:szCs w:val="20"/>
+          <w:lang w:val="es-CL"/>
+        </w:rPr>
+        <w:t>cards</w:t>
+      </w:r>
+      <w:proofErr w:type="spellEnd"/>
+      <w:r>
+        <w:rPr>
+          <w:rFonts w:ascii="Arial" w:hAnsi="Arial" w:cs="Arial"/>
+          <w:sz w:val="20"/>
+          <w:szCs w:val="20"/>
+          <w:lang w:val="es-CL"/>
+        </w:rPr>
+        <w:t xml:space="preserve">, listas, filtros, modales y </w:t>
+      </w:r>
+      <w:proofErr w:type="spellStart"/>
+      <w:r>
+        <w:rPr>
+          <w:rFonts w:ascii="Arial" w:hAnsi="Arial" w:cs="Arial"/>
+          <w:sz w:val="20"/>
+          <w:szCs w:val="20"/>
+          <w:lang w:val="es-CL"/>
+        </w:rPr>
+        <w:t>headers</w:t>
+      </w:r>
+      <w:proofErr w:type="spellEnd"/>
+      <w:r>
+        <w:rPr>
+          <w:rFonts w:ascii="Arial" w:hAnsi="Arial" w:cs="Arial"/>
+          <w:sz w:val="20"/>
+          <w:szCs w:val="20"/>
+          <w:lang w:val="es-CL"/>
+        </w:rPr>
+        <w:t>/</w:t>
+      </w:r>
+      <w:proofErr w:type="spellStart"/>
+      <w:r>
+        <w:rPr>
+          <w:rFonts w:ascii="Arial" w:hAnsi="Arial" w:cs="Arial"/>
+          <w:sz w:val="20"/>
+          <w:szCs w:val="20"/>
+          <w:lang w:val="es-CL"/>
+        </w:rPr>
+        <w:t>footer</w:t>
+      </w:r>
+      <w:proofErr w:type="spellEnd"/>
+      <w:r>
+        <w:rPr>
+          <w:rFonts w:ascii="Arial" w:hAnsi="Arial" w:cs="Arial"/>
+          <w:sz w:val="20"/>
+          <w:szCs w:val="20"/>
+          <w:lang w:val="es-CL"/>
+        </w:rPr>
+        <w:t xml:space="preserve"> reutilizados entre home, resultados, detalle, favoritos y panel </w:t>
+      </w:r>
+      <w:proofErr w:type="spellStart"/>
+      <w:r>
+        <w:rPr>
+          <w:rFonts w:ascii="Arial" w:hAnsi="Arial" w:cs="Arial"/>
+          <w:sz w:val="20"/>
+          <w:szCs w:val="20"/>
+          <w:lang w:val="es-CL"/>
+        </w:rPr>
+        <w:t>admin</w:t>
+      </w:r>
+      <w:proofErr w:type="spellEnd"/>
+      <w:r>
+        <w:rPr>
+          <w:rFonts w:ascii="Arial" w:hAnsi="Arial" w:cs="Arial"/>
+          <w:sz w:val="20"/>
+          <w:szCs w:val="20"/>
+          <w:lang w:val="es-CL"/>
+        </w:rPr>
+        <w:t>.</w:t>
       </w:r>
     </w:p>
     <w:p>
@@ -17684,7 +19920,47 @@
           <w:szCs w:val="20"/>
           <w:lang w:val="es-CL"/>
         </w:rPr>
-        <w:t>Servicios internos: módulo de recomendación y reglas de compatibilidad versionados para reusarlos en nuevas vistas o APIs; helpers de validación y utilidades comunes.</w:t>
+        <w:t xml:space="preserve">Servicios internos: módulo de recomendación y reglas de compatibilidad versionados para reusarlos en nuevas vistas o </w:t>
+      </w:r>
+      <w:proofErr w:type="spellStart"/>
+      <w:r>
+        <w:rPr>
+          <w:rFonts w:ascii="Arial" w:hAnsi="Arial" w:cs="Arial"/>
+          <w:sz w:val="20"/>
+          <w:szCs w:val="20"/>
+          <w:lang w:val="es-CL"/>
+        </w:rPr>
+        <w:t>APIs</w:t>
+      </w:r>
+      <w:proofErr w:type="spellEnd"/>
+      <w:r>
+        <w:rPr>
+          <w:rFonts w:ascii="Arial" w:hAnsi="Arial" w:cs="Arial"/>
+          <w:sz w:val="20"/>
+          <w:szCs w:val="20"/>
+          <w:lang w:val="es-CL"/>
+        </w:rPr>
+        <w:t xml:space="preserve">; </w:t>
+      </w:r>
+      <w:proofErr w:type="spellStart"/>
+      <w:r>
+        <w:rPr>
+          <w:rFonts w:ascii="Arial" w:hAnsi="Arial" w:cs="Arial"/>
+          <w:sz w:val="20"/>
+          <w:szCs w:val="20"/>
+          <w:lang w:val="es-CL"/>
+        </w:rPr>
+        <w:t>helpers</w:t>
+      </w:r>
+      <w:proofErr w:type="spellEnd"/>
+      <w:r>
+        <w:rPr>
+          <w:rFonts w:ascii="Arial" w:hAnsi="Arial" w:cs="Arial"/>
+          <w:sz w:val="20"/>
+          <w:szCs w:val="20"/>
+          <w:lang w:val="es-CL"/>
+        </w:rPr>
+        <w:t xml:space="preserve"> de validación y utilidades comunes.</w:t>
       </w:r>
     </w:p>
     <w:p>
@@ -17760,7 +20036,27 @@
           <w:szCs w:val="20"/>
           <w:lang w:val="es-CL"/>
         </w:rPr>
-        <w:t>Lecciones aprendidas: controles de contraste/tema claro-oscuro, manejo de datos incompletos en fichas, y fallbacks del motor para evitar errores visibles al usuario.</w:t>
+        <w:t xml:space="preserve">Lecciones aprendidas: controles de contraste/tema claro-oscuro, manejo de datos incompletos en fichas, y </w:t>
+      </w:r>
+      <w:proofErr w:type="spellStart"/>
+      <w:r>
+        <w:rPr>
+          <w:rFonts w:ascii="Arial" w:hAnsi="Arial" w:cs="Arial"/>
+          <w:sz w:val="20"/>
+          <w:szCs w:val="20"/>
+          <w:lang w:val="es-CL"/>
+        </w:rPr>
+        <w:t>fallbacks</w:t>
+      </w:r>
+      <w:proofErr w:type="spellEnd"/>
+      <w:r>
+        <w:rPr>
+          <w:rFonts w:ascii="Arial" w:hAnsi="Arial" w:cs="Arial"/>
+          <w:sz w:val="20"/>
+          <w:szCs w:val="20"/>
+          <w:lang w:val="es-CL"/>
+        </w:rPr>
+        <w:t xml:space="preserve"> del motor para evitar errores visibles al usuario.</w:t>
       </w:r>
     </w:p>
     <w:p>
@@ -17836,7 +20132,47 @@
           <w:szCs w:val="20"/>
           <w:lang w:val="es-CL"/>
         </w:rPr>
-        <w:t>Uso de collectstatic y serving de estáticos optimizado; opcional cache (Redis) si se despliega en ambiente que lo soporte.</w:t>
+        <w:t xml:space="preserve">Uso de </w:t>
+      </w:r>
+      <w:proofErr w:type="spellStart"/>
+      <w:r>
+        <w:rPr>
+          <w:rFonts w:ascii="Arial" w:hAnsi="Arial" w:cs="Arial"/>
+          <w:sz w:val="20"/>
+          <w:szCs w:val="20"/>
+          <w:lang w:val="es-CL"/>
+        </w:rPr>
+        <w:t>collectstatic</w:t>
+      </w:r>
+      <w:proofErr w:type="spellEnd"/>
+      <w:r>
+        <w:rPr>
+          <w:rFonts w:ascii="Arial" w:hAnsi="Arial" w:cs="Arial"/>
+          <w:sz w:val="20"/>
+          <w:szCs w:val="20"/>
+          <w:lang w:val="es-CL"/>
+        </w:rPr>
+        <w:t xml:space="preserve"> y </w:t>
+      </w:r>
+      <w:proofErr w:type="spellStart"/>
+      <w:r>
+        <w:rPr>
+          <w:rFonts w:ascii="Arial" w:hAnsi="Arial" w:cs="Arial"/>
+          <w:sz w:val="20"/>
+          <w:szCs w:val="20"/>
+          <w:lang w:val="es-CL"/>
+        </w:rPr>
+        <w:t>serving</w:t>
+      </w:r>
+      <w:proofErr w:type="spellEnd"/>
+      <w:r>
+        <w:rPr>
+          <w:rFonts w:ascii="Arial" w:hAnsi="Arial" w:cs="Arial"/>
+          <w:sz w:val="20"/>
+          <w:szCs w:val="20"/>
+          <w:lang w:val="es-CL"/>
+        </w:rPr>
+        <w:t xml:space="preserve"> de estáticos optimizado; opcional cache (Redis) si se despliega en ambiente que lo soporte.</w:t>
       </w:r>
     </w:p>
     <w:p>

</xml_diff>